<commit_message>
Update registry metadata document
Co-Authored-By: Claude Opus 4.6 <noreply@anthropic.com>
</commit_message>
<xml_diff>
--- a/shared/gjesus3_RDM_registryMetadata.docx
+++ b/shared/gjesus3_RDM_registryMetadata.docx
@@ -27,13 +27,7 @@
     </w:p>
     <w:p>
       <w:r>
-        <w:t xml:space="preserve">The following describes how the </w:t>
-      </w:r>
-      <w:r>
-        <w:t>new 100 TB drive for the MFB group will be organized into operational sections or storage areas</w:t>
-      </w:r>
-      <w:r>
-        <w:t xml:space="preserve"> and how the contents of these areas will be documented using registries.</w:t>
+        <w:t>The following describes how the new 100 TB drive for the MFB group will be organized into operational sections or storage areas and how the contents of these areas will be documented using registries.</w:t>
       </w:r>
       <w:r>
         <w:t xml:space="preserve"> It is important to </w:t>
@@ -79,26 +73,14 @@
     </w:p>
     <w:p>
       <w:r>
-        <w:t>The new 100 TB drive for the MFB group will be organized into operational sections or storage areas.  Each of these areas regards data in a different context</w:t>
-      </w:r>
-      <w:r>
-        <w:t xml:space="preserve">, </w:t>
-      </w:r>
-      <w:r>
-        <w:t>implied retention time</w:t>
-      </w:r>
-      <w:r>
-        <w:t xml:space="preserve"> and set of rules</w:t>
-      </w:r>
-      <w:r>
-        <w:t>.</w:t>
+        <w:t>The new 100 TB drive for the MFB group will be organized into operational sections or storage areas.  Each of these areas regards data in a different context, implied retention time and set of rules.</w:t>
       </w:r>
     </w:p>
     <w:p>
       <w:pPr>
         <w:numPr>
           <w:ilvl w:val="0"/>
-          <w:numId w:val="1"/>
+          <w:numId w:val="3"/>
         </w:numPr>
       </w:pPr>
       <w:r>
@@ -109,7 +91,7 @@
       <w:pPr>
         <w:numPr>
           <w:ilvl w:val="1"/>
-          <w:numId w:val="1"/>
+          <w:numId w:val="3"/>
         </w:numPr>
       </w:pPr>
       <w:r>
@@ -127,7 +109,7 @@
       <w:pPr>
         <w:numPr>
           <w:ilvl w:val="1"/>
-          <w:numId w:val="1"/>
+          <w:numId w:val="3"/>
         </w:numPr>
       </w:pPr>
       <w:r>
@@ -161,7 +143,7 @@
       <w:pPr>
         <w:numPr>
           <w:ilvl w:val="1"/>
-          <w:numId w:val="1"/>
+          <w:numId w:val="3"/>
         </w:numPr>
       </w:pPr>
       <w:r>
@@ -185,7 +167,7 @@
       <w:pPr>
         <w:numPr>
           <w:ilvl w:val="1"/>
-          <w:numId w:val="1"/>
+          <w:numId w:val="3"/>
         </w:numPr>
       </w:pPr>
       <w:r>
@@ -209,57 +191,12 @@
     </w:p>
     <w:p>
       <w:r>
-        <w:t>Each of the t</w:t>
-      </w:r>
-      <w:r>
-        <w:t xml:space="preserve">hree areas will require a registry.  A registry is an index or a list of the contents of the area. We call it a registry because you </w:t>
-      </w:r>
-      <w:r>
-        <w:t>‘</w:t>
-      </w:r>
-      <w:r>
-        <w:t>register</w:t>
-      </w:r>
-      <w:r>
-        <w:t>’</w:t>
-      </w:r>
-      <w:r>
-        <w:t xml:space="preserve"> an item (add an entry to the </w:t>
-      </w:r>
-      <w:r>
-        <w:t>index</w:t>
-      </w:r>
-      <w:r>
-        <w:t xml:space="preserve">) when it is created. </w:t>
-      </w:r>
-    </w:p>
-    <w:p>
-      <w:r>
-        <w:t xml:space="preserve">The registries are basically a table of entries along the rows </w:t>
-      </w:r>
-      <w:r>
-        <w:t>with</w:t>
-      </w:r>
-      <w:r>
-        <w:t xml:space="preserve"> metadata </w:t>
-      </w:r>
-      <w:r>
-        <w:t xml:space="preserve">fields </w:t>
-      </w:r>
-      <w:r>
-        <w:t xml:space="preserve">along the columns. We need to determine the metadata fields </w:t>
-      </w:r>
-      <w:r>
-        <w:t>(</w:t>
-      </w:r>
-      <w:r>
-        <w:t xml:space="preserve">columns in the table) we want to capture and keep quickly accessible. Sometimes these entries can be autogenerated by scripts, and </w:t>
-      </w:r>
-      <w:r>
-        <w:t>sometimes</w:t>
-      </w:r>
-      <w:r>
-        <w:t xml:space="preserve"> it will be manual (entry or updates of specific fields).</w:t>
+        <w:t xml:space="preserve">Each of the three areas will require a registry.  A registry is an index or a list of the contents of the area. We call it a registry because you ‘register’ an item (add an entry to the index) when it is created. </w:t>
+      </w:r>
+    </w:p>
+    <w:p>
+      <w:r>
+        <w:t>The registries are basically a table of entries along the rows with metadata fields along the columns. We need to determine the metadata fields (columns in the table) we want to capture and keep quickly accessible. Sometimes these entries can be autogenerated by scripts, and sometimes it will be manual (entry or updates of specific fields).</w:t>
       </w:r>
     </w:p>
     <w:p>
@@ -309,11 +246,7 @@
         <w:t xml:space="preserve">in PET </w:t>
       </w:r>
       <w:r>
-        <w:t xml:space="preserve">it would be more appropriate for us to store </w:t>
-      </w:r>
-      <w:r>
-        <w:lastRenderedPageBreak/>
-        <w:t>reconstructed DICOM files</w:t>
+        <w:t>it would be more appropriate for us to store reconstructed DICOM files</w:t>
       </w:r>
       <w:r>
         <w:t xml:space="preserve"> rather than the massive event detection lists actually generated by the scan). </w:t>
@@ -829,79 +762,7 @@
                 <w:lang w:eastAsia="en-GB"/>
                 <w14:ligatures w14:val="none"/>
               </w:rPr>
-              <w:t xml:space="preserve">A unique, </w:t>
-            </w:r>
-            <w:r>
-              <w:rPr>
-                <w:rFonts w:ascii="Aptos Narrow" w:eastAsia="Times New Roman" w:hAnsi="Aptos Narrow" w:cs="Times New Roman"/>
-                <w:color w:val="000000"/>
-                <w:kern w:val="0"/>
-                <w:sz w:val="22"/>
-                <w:szCs w:val="22"/>
-                <w:lang w:eastAsia="en-GB"/>
-                <w14:ligatures w14:val="none"/>
-              </w:rPr>
-              <w:t>systematically</w:t>
-            </w:r>
-            <w:r>
-              <w:rPr>
-                <w:rFonts w:ascii="Aptos Narrow" w:eastAsia="Times New Roman" w:hAnsi="Aptos Narrow" w:cs="Times New Roman"/>
-                <w:color w:val="000000"/>
-                <w:kern w:val="0"/>
-                <w:sz w:val="22"/>
-                <w:szCs w:val="22"/>
-                <w:lang w:eastAsia="en-GB"/>
-                <w14:ligatures w14:val="none"/>
-              </w:rPr>
-              <w:t xml:space="preserve"> generated ID for each </w:t>
-            </w:r>
-            <w:r>
-              <w:rPr>
-                <w:rFonts w:ascii="Aptos Narrow" w:eastAsia="Times New Roman" w:hAnsi="Aptos Narrow" w:cs="Times New Roman"/>
-                <w:color w:val="000000"/>
-                <w:kern w:val="0"/>
-                <w:sz w:val="22"/>
-                <w:szCs w:val="22"/>
-                <w:lang w:eastAsia="en-GB"/>
-                <w14:ligatures w14:val="none"/>
-              </w:rPr>
-              <w:t>individual</w:t>
-            </w:r>
-            <w:r>
-              <w:rPr>
-                <w:rFonts w:ascii="Aptos Narrow" w:eastAsia="Times New Roman" w:hAnsi="Aptos Narrow" w:cs="Times New Roman"/>
-                <w:color w:val="000000"/>
-                <w:kern w:val="0"/>
-                <w:sz w:val="22"/>
-                <w:szCs w:val="22"/>
-                <w:lang w:eastAsia="en-GB"/>
-                <w14:ligatures w14:val="none"/>
-              </w:rPr>
-              <w:t xml:space="preserve"> </w:t>
-            </w:r>
-            <w:r>
-              <w:rPr>
-                <w:rFonts w:ascii="Aptos Narrow" w:eastAsia="Times New Roman" w:hAnsi="Aptos Narrow" w:cs="Times New Roman"/>
-                <w:color w:val="000000"/>
-                <w:kern w:val="0"/>
-                <w:sz w:val="22"/>
-                <w:szCs w:val="22"/>
-                <w:lang w:eastAsia="en-GB"/>
-                <w14:ligatures w14:val="none"/>
-              </w:rPr>
-              <w:t>acquisition</w:t>
-            </w:r>
-            <w:r>
-              <w:rPr>
-                <w:rFonts w:ascii="Aptos Narrow" w:eastAsia="Times New Roman" w:hAnsi="Aptos Narrow" w:cs="Times New Roman"/>
-                <w:color w:val="000000"/>
-                <w:kern w:val="0"/>
-                <w:sz w:val="22"/>
-                <w:szCs w:val="22"/>
-                <w:lang w:eastAsia="en-GB"/>
-                <w14:ligatures w14:val="none"/>
-              </w:rPr>
-              <w:t xml:space="preserve"> (Scan or Assay)</w:t>
+              <w:t>A unique, systematically generated ID for each individual acquisition (Scan or Assay)</w:t>
             </w:r>
           </w:p>
         </w:tc>
@@ -1007,19 +868,7 @@
                 <w:lang w:eastAsia="en-GB"/>
                 <w14:ligatures w14:val="none"/>
               </w:rPr>
-              <w:t>acquisition</w:t>
-            </w:r>
-            <w:r>
-              <w:rPr>
-                <w:rFonts w:ascii="Aptos Narrow" w:eastAsia="Times New Roman" w:hAnsi="Aptos Narrow" w:cs="Times New Roman"/>
-                <w:color w:val="000000"/>
-                <w:kern w:val="0"/>
-                <w:sz w:val="22"/>
-                <w:szCs w:val="22"/>
-                <w:lang w:eastAsia="en-GB"/>
-                <w14:ligatures w14:val="none"/>
-              </w:rPr>
-              <w:t xml:space="preserve"> datetime</w:t>
+              <w:t>acquisition datetime</w:t>
             </w:r>
           </w:p>
         </w:tc>
@@ -1051,55 +900,7 @@
                 <w:lang w:eastAsia="en-GB"/>
                 <w14:ligatures w14:val="none"/>
               </w:rPr>
-              <w:t xml:space="preserve">Time it was </w:t>
-            </w:r>
-            <w:r>
-              <w:rPr>
-                <w:rFonts w:ascii="Aptos Narrow" w:eastAsia="Times New Roman" w:hAnsi="Aptos Narrow" w:cs="Times New Roman"/>
-                <w:color w:val="000000"/>
-                <w:kern w:val="0"/>
-                <w:sz w:val="22"/>
-                <w:szCs w:val="22"/>
-                <w:lang w:eastAsia="en-GB"/>
-                <w14:ligatures w14:val="none"/>
-              </w:rPr>
-              <w:t>acquired</w:t>
-            </w:r>
-            <w:r>
-              <w:rPr>
-                <w:rFonts w:ascii="Aptos Narrow" w:eastAsia="Times New Roman" w:hAnsi="Aptos Narrow" w:cs="Times New Roman"/>
-                <w:color w:val="000000"/>
-                <w:kern w:val="0"/>
-                <w:sz w:val="22"/>
-                <w:szCs w:val="22"/>
-                <w:lang w:eastAsia="en-GB"/>
-                <w14:ligatures w14:val="none"/>
-              </w:rPr>
-              <w:t xml:space="preserve"> (better but hard to automate for all cases, some modalities may </w:t>
-            </w:r>
-            <w:r>
-              <w:rPr>
-                <w:rFonts w:ascii="Aptos Narrow" w:eastAsia="Times New Roman" w:hAnsi="Aptos Narrow" w:cs="Times New Roman"/>
-                <w:color w:val="000000"/>
-                <w:kern w:val="0"/>
-                <w:sz w:val="22"/>
-                <w:szCs w:val="22"/>
-                <w:lang w:eastAsia="en-GB"/>
-                <w14:ligatures w14:val="none"/>
-              </w:rPr>
-              <w:t>embedded</w:t>
-            </w:r>
-            <w:r>
-              <w:rPr>
-                <w:rFonts w:ascii="Aptos Narrow" w:eastAsia="Times New Roman" w:hAnsi="Aptos Narrow" w:cs="Times New Roman"/>
-                <w:color w:val="000000"/>
-                <w:kern w:val="0"/>
-                <w:sz w:val="22"/>
-                <w:szCs w:val="22"/>
-                <w:lang w:eastAsia="en-GB"/>
-                <w14:ligatures w14:val="none"/>
-              </w:rPr>
-              <w:t xml:space="preserve"> it in the file, could be added to extended metadata at another stage)</w:t>
+              <w:t>Time it was acquired (better but hard to automate for all cases, some modalities may embedded it in the file, could be added to extended metadata at another stage)</w:t>
             </w:r>
           </w:p>
         </w:tc>
@@ -1192,91 +993,7 @@
                 <w:lang w:eastAsia="en-GB"/>
                 <w14:ligatures w14:val="none"/>
               </w:rPr>
-              <w:t xml:space="preserve">Still deciding to </w:t>
-            </w:r>
-            <w:r>
-              <w:rPr>
-                <w:rFonts w:ascii="Aptos Narrow" w:eastAsia="Times New Roman" w:hAnsi="Aptos Narrow" w:cs="Times New Roman"/>
-                <w:color w:val="000000"/>
-                <w:kern w:val="0"/>
-                <w:sz w:val="22"/>
-                <w:szCs w:val="22"/>
-                <w:lang w:eastAsia="en-GB"/>
-                <w14:ligatures w14:val="none"/>
-              </w:rPr>
-              <w:t>organize</w:t>
-            </w:r>
-            <w:r>
-              <w:rPr>
-                <w:rFonts w:ascii="Aptos Narrow" w:eastAsia="Times New Roman" w:hAnsi="Aptos Narrow" w:cs="Times New Roman"/>
-                <w:color w:val="000000"/>
-                <w:kern w:val="0"/>
-                <w:sz w:val="22"/>
-                <w:szCs w:val="22"/>
-                <w:lang w:eastAsia="en-GB"/>
-                <w14:ligatures w14:val="none"/>
-              </w:rPr>
-              <w:t xml:space="preserve"> by specific </w:t>
-            </w:r>
-            <w:r>
-              <w:rPr>
-                <w:rFonts w:ascii="Aptos Narrow" w:eastAsia="Times New Roman" w:hAnsi="Aptos Narrow" w:cs="Times New Roman"/>
-                <w:color w:val="000000"/>
-                <w:kern w:val="0"/>
-                <w:sz w:val="22"/>
-                <w:szCs w:val="22"/>
-                <w:lang w:eastAsia="en-GB"/>
-                <w14:ligatures w14:val="none"/>
-              </w:rPr>
-              <w:t>instrument</w:t>
-            </w:r>
-            <w:r>
-              <w:rPr>
-                <w:rFonts w:ascii="Aptos Narrow" w:eastAsia="Times New Roman" w:hAnsi="Aptos Narrow" w:cs="Times New Roman"/>
-                <w:color w:val="000000"/>
-                <w:kern w:val="0"/>
-                <w:sz w:val="22"/>
-                <w:szCs w:val="22"/>
-                <w:lang w:eastAsia="en-GB"/>
-                <w14:ligatures w14:val="none"/>
-              </w:rPr>
-              <w:t xml:space="preserve"> or if </w:t>
-            </w:r>
-            <w:r>
-              <w:rPr>
-                <w:rFonts w:ascii="Aptos Narrow" w:eastAsia="Times New Roman" w:hAnsi="Aptos Narrow" w:cs="Times New Roman"/>
-                <w:color w:val="000000"/>
-                <w:kern w:val="0"/>
-                <w:sz w:val="22"/>
-                <w:szCs w:val="22"/>
-                <w:lang w:eastAsia="en-GB"/>
-                <w14:ligatures w14:val="none"/>
-              </w:rPr>
-              <w:t>modality</w:t>
-            </w:r>
-            <w:r>
-              <w:rPr>
-                <w:rFonts w:ascii="Aptos Narrow" w:eastAsia="Times New Roman" w:hAnsi="Aptos Narrow" w:cs="Times New Roman"/>
-                <w:color w:val="000000"/>
-                <w:kern w:val="0"/>
-                <w:sz w:val="22"/>
-                <w:szCs w:val="22"/>
-                <w:lang w:eastAsia="en-GB"/>
-                <w14:ligatures w14:val="none"/>
-              </w:rPr>
-              <w:t xml:space="preserve"> is </w:t>
-            </w:r>
-            <w:r>
-              <w:rPr>
-                <w:rFonts w:ascii="Aptos Narrow" w:eastAsia="Times New Roman" w:hAnsi="Aptos Narrow" w:cs="Times New Roman"/>
-                <w:color w:val="000000"/>
-                <w:kern w:val="0"/>
-                <w:sz w:val="22"/>
-                <w:szCs w:val="22"/>
-                <w:lang w:eastAsia="en-GB"/>
-                <w14:ligatures w14:val="none"/>
-              </w:rPr>
-              <w:t>sufficient</w:t>
+              <w:t>Still deciding to organize by specific instrument or if modality is sufficient</w:t>
             </w:r>
           </w:p>
         </w:tc>
@@ -1382,7 +1099,6 @@
                 <w:lang w:eastAsia="en-GB"/>
                 <w14:ligatures w14:val="none"/>
               </w:rPr>
-              <w:lastRenderedPageBreak/>
               <w:t>sample/animal ID</w:t>
             </w:r>
           </w:p>
@@ -1415,19 +1131,7 @@
                 <w:lang w:eastAsia="en-GB"/>
                 <w14:ligatures w14:val="none"/>
               </w:rPr>
-              <w:t>Self-evident</w:t>
-            </w:r>
-            <w:r>
-              <w:rPr>
-                <w:rFonts w:ascii="Aptos Narrow" w:eastAsia="Times New Roman" w:hAnsi="Aptos Narrow" w:cs="Times New Roman"/>
-                <w:color w:val="000000"/>
-                <w:kern w:val="0"/>
-                <w:sz w:val="22"/>
-                <w:szCs w:val="22"/>
-                <w:lang w:eastAsia="en-GB"/>
-                <w14:ligatures w14:val="none"/>
-              </w:rPr>
-              <w:t xml:space="preserve"> for animal, need to discuss for sample, although this would be in extended metadata, I think it is important enough to be here too.</w:t>
+              <w:t>Self-evident for animal, need to discuss for sample, although this would be in extended metadata, I think it is important enough to be here too.</w:t>
             </w:r>
           </w:p>
         </w:tc>
@@ -1496,31 +1200,7 @@
                 <w:lang w:eastAsia="en-GB"/>
                 <w14:ligatures w14:val="none"/>
               </w:rPr>
-              <w:t xml:space="preserve">This is </w:t>
-            </w:r>
-            <w:r>
-              <w:rPr>
-                <w:rFonts w:ascii="Aptos Narrow" w:eastAsia="Times New Roman" w:hAnsi="Aptos Narrow" w:cs="Times New Roman"/>
-                <w:color w:val="000000"/>
-                <w:kern w:val="0"/>
-                <w:sz w:val="22"/>
-                <w:szCs w:val="22"/>
-                <w:lang w:eastAsia="en-GB"/>
-                <w14:ligatures w14:val="none"/>
-              </w:rPr>
-              <w:t>referring</w:t>
-            </w:r>
-            <w:r>
-              <w:rPr>
-                <w:rFonts w:ascii="Aptos Narrow" w:eastAsia="Times New Roman" w:hAnsi="Aptos Narrow" w:cs="Times New Roman"/>
-                <w:color w:val="000000"/>
-                <w:kern w:val="0"/>
-                <w:sz w:val="22"/>
-                <w:szCs w:val="22"/>
-                <w:lang w:eastAsia="en-GB"/>
-                <w14:ligatures w14:val="none"/>
-              </w:rPr>
-              <w:t xml:space="preserve"> to the actual data file</w:t>
+              <w:t>This is referring to the actual data file</w:t>
             </w:r>
           </w:p>
         </w:tc>
@@ -1899,31 +1579,7 @@
                 <w:lang w:eastAsia="en-GB"/>
                 <w14:ligatures w14:val="none"/>
               </w:rPr>
-              <w:t xml:space="preserve"> if we should expect a file in the same folder that was </w:t>
-            </w:r>
-            <w:r>
-              <w:rPr>
-                <w:rFonts w:ascii="Aptos Narrow" w:eastAsia="Times New Roman" w:hAnsi="Aptos Narrow" w:cs="Times New Roman"/>
-                <w:color w:val="000000"/>
-                <w:kern w:val="0"/>
-                <w:sz w:val="22"/>
-                <w:szCs w:val="22"/>
-                <w:lang w:eastAsia="en-GB"/>
-                <w14:ligatures w14:val="none"/>
-              </w:rPr>
-              <w:t>generated</w:t>
-            </w:r>
-            <w:r>
-              <w:rPr>
-                <w:rFonts w:ascii="Aptos Narrow" w:eastAsia="Times New Roman" w:hAnsi="Aptos Narrow" w:cs="Times New Roman"/>
-                <w:color w:val="000000"/>
-                <w:kern w:val="0"/>
-                <w:sz w:val="22"/>
-                <w:szCs w:val="22"/>
-                <w:lang w:eastAsia="en-GB"/>
-                <w14:ligatures w14:val="none"/>
-              </w:rPr>
-              <w:t xml:space="preserve"> to verify proper data upload - no corruption</w:t>
+              <w:t xml:space="preserve"> if we should expect a file in the same folder that was generated to verify proper data upload - no corruption</w:t>
             </w:r>
           </w:p>
         </w:tc>
@@ -1984,6 +1640,1029 @@
       </w:r>
       <w:r>
         <w:t xml:space="preserve">Once publications are closed (published) they become static repositories not meant to be edited.  </w:t>
+      </w:r>
+    </w:p>
+    <w:p>
+      <w:r>
+        <w:t>Here we are interested in your feedback of the metadata fields for the registry. It is likely these will need to be manually created and updated, so we are keeping it light.</w:t>
+      </w:r>
+    </w:p>
+    <w:tbl>
+      <w:tblPr>
+        <w:tblStyle w:val="TableGrid"/>
+        <w:tblW w:w="9646" w:type="dxa"/>
+        <w:tblLook w:val="04A0" w:firstRow="1" w:lastRow="0" w:firstColumn="1" w:lastColumn="0" w:noHBand="0" w:noVBand="1"/>
+      </w:tblPr>
+      <w:tblGrid>
+        <w:gridCol w:w="2661"/>
+        <w:gridCol w:w="7059"/>
+      </w:tblGrid>
+      <w:tr>
+        <w:trPr>
+          <w:trHeight w:val="300"/>
+        </w:trPr>
+        <w:tc>
+          <w:tcPr>
+            <w:tcW w:w="2587" w:type="dxa"/>
+            <w:shd w:val="clear" w:color="auto" w:fill="F2F2F2" w:themeFill="background1" w:themeFillShade="F2"/>
+            <w:noWrap/>
+            <w:hideMark/>
+          </w:tcPr>
+          <w:p>
+            <w:pPr>
+              <w:rPr>
+                <w:rFonts w:ascii="Aptos Narrow" w:eastAsia="Times New Roman" w:hAnsi="Aptos Narrow" w:cs="Times New Roman"/>
+                <w:b/>
+                <w:bCs/>
+                <w:color w:val="000000"/>
+                <w:kern w:val="0"/>
+                <w:sz w:val="22"/>
+                <w:szCs w:val="22"/>
+                <w:lang w:eastAsia="en-GB"/>
+                <w14:ligatures w14:val="none"/>
+              </w:rPr>
+            </w:pPr>
+            <w:commentRangeStart w:id="2"/>
+            <w:r>
+              <w:rPr>
+                <w:rFonts w:ascii="Aptos Narrow" w:eastAsia="Times New Roman" w:hAnsi="Aptos Narrow" w:cs="Times New Roman"/>
+                <w:b/>
+                <w:bCs/>
+                <w:color w:val="000000"/>
+                <w:kern w:val="0"/>
+                <w:sz w:val="22"/>
+                <w:szCs w:val="22"/>
+                <w:lang w:eastAsia="en-GB"/>
+                <w14:ligatures w14:val="none"/>
+              </w:rPr>
+              <w:t>Field</w:t>
+            </w:r>
+            <w:commentRangeEnd w:id="2"/>
+            <w:r>
+              <w:rPr>
+                <w:rStyle w:val="CommentReference"/>
+                <w:rFonts w:ascii="Aptos Narrow" w:eastAsia="Times New Roman" w:hAnsi="Aptos Narrow" w:cs="Times New Roman"/>
+                <w:b/>
+                <w:bCs/>
+                <w:color w:val="000000"/>
+                <w:kern w:val="0"/>
+                <w:sz w:val="22"/>
+                <w:szCs w:val="22"/>
+                <w:lang w:eastAsia="en-GB"/>
+                <w14:ligatures w14:val="none"/>
+              </w:rPr>
+              <w:commentReference w:id="2"/>
+            </w:r>
+          </w:p>
+        </w:tc>
+        <w:tc>
+          <w:tcPr>
+            <w:tcW w:w="7059" w:type="dxa"/>
+            <w:shd w:val="clear" w:color="auto" w:fill="F2F2F2" w:themeFill="background1" w:themeFillShade="F2"/>
+            <w:noWrap/>
+            <w:hideMark/>
+          </w:tcPr>
+          <w:p>
+            <w:pPr>
+              <w:rPr>
+                <w:rFonts w:ascii="Aptos Narrow" w:eastAsia="Times New Roman" w:hAnsi="Aptos Narrow" w:cs="Times New Roman"/>
+                <w:b/>
+                <w:bCs/>
+                <w:color w:val="000000"/>
+                <w:kern w:val="0"/>
+                <w:sz w:val="22"/>
+                <w:szCs w:val="22"/>
+                <w:lang w:eastAsia="en-GB"/>
+                <w14:ligatures w14:val="none"/>
+              </w:rPr>
+            </w:pPr>
+            <w:r>
+              <w:rPr>
+                <w:rFonts w:ascii="Aptos Narrow" w:eastAsia="Times New Roman" w:hAnsi="Aptos Narrow" w:cs="Times New Roman"/>
+                <w:b/>
+                <w:bCs/>
+                <w:color w:val="000000"/>
+                <w:kern w:val="0"/>
+                <w:sz w:val="22"/>
+                <w:szCs w:val="22"/>
+                <w:lang w:eastAsia="en-GB"/>
+                <w14:ligatures w14:val="none"/>
+              </w:rPr>
+              <w:t xml:space="preserve">Description </w:t>
+            </w:r>
+          </w:p>
+        </w:tc>
+      </w:tr>
+      <w:tr>
+        <w:trPr>
+          <w:trHeight w:val="300"/>
+        </w:trPr>
+        <w:tc>
+          <w:tcPr>
+            <w:tcW w:w="2587" w:type="dxa"/>
+            <w:noWrap/>
+          </w:tcPr>
+          <w:p>
+            <w:pPr>
+              <w:rPr>
+                <w:rFonts w:ascii="Aptos Narrow" w:eastAsia="Times New Roman" w:hAnsi="Aptos Narrow" w:cs="Times New Roman"/>
+                <w:color w:val="000000"/>
+                <w:kern w:val="0"/>
+                <w:sz w:val="22"/>
+                <w:szCs w:val="22"/>
+                <w:lang w:eastAsia="en-GB"/>
+                <w14:ligatures w14:val="none"/>
+              </w:rPr>
+            </w:pPr>
+            <w:r>
+              <w:rPr>
+                <w:rFonts w:ascii="Aptos Narrow" w:eastAsia="Times New Roman" w:hAnsi="Aptos Narrow" w:cs="Times New Roman"/>
+                <w:color w:val="000000"/>
+                <w:kern w:val="0"/>
+                <w:sz w:val="22"/>
+                <w:szCs w:val="22"/>
+                <w:lang w:eastAsia="en-GB"/>
+                <w14:ligatures w14:val="none"/>
+              </w:rPr>
+              <w:t>PubID</w:t>
+            </w:r>
+          </w:p>
+        </w:tc>
+        <w:tc>
+          <w:tcPr>
+            <w:tcW w:w="7059" w:type="dxa"/>
+            <w:noWrap/>
+          </w:tcPr>
+          <w:p>
+            <w:pPr>
+              <w:rPr>
+                <w:rFonts w:ascii="Aptos Narrow" w:eastAsia="Times New Roman" w:hAnsi="Aptos Narrow" w:cs="Times New Roman"/>
+                <w:color w:val="000000"/>
+                <w:kern w:val="0"/>
+                <w:sz w:val="22"/>
+                <w:szCs w:val="22"/>
+                <w:lang w:eastAsia="en-GB"/>
+                <w14:ligatures w14:val="none"/>
+              </w:rPr>
+            </w:pPr>
+            <w:r>
+              <w:rPr>
+                <w:rFonts w:ascii="Aptos Narrow" w:eastAsia="Times New Roman" w:hAnsi="Aptos Narrow" w:cs="Times New Roman"/>
+                <w:color w:val="000000"/>
+                <w:kern w:val="0"/>
+                <w:sz w:val="22"/>
+                <w:szCs w:val="22"/>
+                <w:lang w:eastAsia="en-GB"/>
+                <w14:ligatures w14:val="none"/>
+              </w:rPr>
+              <w:t xml:space="preserve">A unique internal ID for each </w:t>
+            </w:r>
+            <w:r>
+              <w:rPr>
+                <w:rFonts w:ascii="Aptos Narrow" w:eastAsia="Times New Roman" w:hAnsi="Aptos Narrow" w:cs="Times New Roman"/>
+                <w:color w:val="000000"/>
+                <w:kern w:val="0"/>
+                <w:sz w:val="22"/>
+                <w:szCs w:val="22"/>
+                <w:lang w:eastAsia="en-GB"/>
+                <w14:ligatures w14:val="none"/>
+              </w:rPr>
+              <w:t>publication</w:t>
+            </w:r>
+            <w:r>
+              <w:rPr>
+                <w:rFonts w:ascii="Aptos Narrow" w:eastAsia="Times New Roman" w:hAnsi="Aptos Narrow" w:cs="Times New Roman"/>
+                <w:color w:val="000000"/>
+                <w:kern w:val="0"/>
+                <w:sz w:val="22"/>
+                <w:szCs w:val="22"/>
+                <w:lang w:eastAsia="en-GB"/>
+                <w14:ligatures w14:val="none"/>
+              </w:rPr>
+              <w:t xml:space="preserve">, likely a counter, e.g. PUB-0001 </w:t>
+            </w:r>
+          </w:p>
+        </w:tc>
+      </w:tr>
+      <w:tr>
+        <w:trPr>
+          <w:trHeight w:val="300"/>
+        </w:trPr>
+        <w:tc>
+          <w:tcPr>
+            <w:tcW w:w="2587" w:type="dxa"/>
+            <w:noWrap/>
+          </w:tcPr>
+          <w:p>
+            <w:pPr>
+              <w:rPr>
+                <w:rFonts w:ascii="Aptos Narrow" w:eastAsia="Times New Roman" w:hAnsi="Aptos Narrow" w:cs="Times New Roman"/>
+                <w:color w:val="000000"/>
+                <w:kern w:val="0"/>
+                <w:sz w:val="22"/>
+                <w:szCs w:val="22"/>
+                <w:lang w:eastAsia="en-GB"/>
+                <w14:ligatures w14:val="none"/>
+              </w:rPr>
+            </w:pPr>
+            <w:r>
+              <w:rPr>
+                <w:rFonts w:ascii="Aptos Narrow" w:eastAsia="Times New Roman" w:hAnsi="Aptos Narrow" w:cs="Times New Roman"/>
+                <w:color w:val="000000"/>
+                <w:kern w:val="0"/>
+                <w:sz w:val="22"/>
+                <w:szCs w:val="22"/>
+                <w:lang w:eastAsia="en-GB"/>
+                <w14:ligatures w14:val="none"/>
+              </w:rPr>
+              <w:t>Short name</w:t>
+            </w:r>
+          </w:p>
+        </w:tc>
+        <w:tc>
+          <w:tcPr>
+            <w:tcW w:w="7059" w:type="dxa"/>
+            <w:noWrap/>
+          </w:tcPr>
+          <w:p>
+            <w:pPr>
+              <w:rPr>
+                <w:rFonts w:ascii="Aptos Narrow" w:eastAsia="Times New Roman" w:hAnsi="Aptos Narrow" w:cs="Times New Roman"/>
+                <w:color w:val="000000"/>
+                <w:kern w:val="0"/>
+                <w:sz w:val="22"/>
+                <w:szCs w:val="22"/>
+                <w:lang w:eastAsia="en-GB"/>
+                <w14:ligatures w14:val="none"/>
+              </w:rPr>
+            </w:pPr>
+            <w:r>
+              <w:rPr>
+                <w:rFonts w:ascii="Aptos Narrow" w:eastAsia="Times New Roman" w:hAnsi="Aptos Narrow" w:cs="Times New Roman"/>
+                <w:color w:val="000000"/>
+                <w:kern w:val="0"/>
+                <w:sz w:val="22"/>
+                <w:szCs w:val="22"/>
+                <w:lang w:eastAsia="en-GB"/>
+                <w14:ligatures w14:val="none"/>
+              </w:rPr>
+              <w:t xml:space="preserve">Short but </w:t>
+            </w:r>
+            <w:r>
+              <w:rPr>
+                <w:rFonts w:ascii="Aptos Narrow" w:eastAsia="Times New Roman" w:hAnsi="Aptos Narrow" w:cs="Times New Roman"/>
+                <w:color w:val="000000"/>
+                <w:kern w:val="0"/>
+                <w:sz w:val="22"/>
+                <w:szCs w:val="22"/>
+                <w:lang w:eastAsia="en-GB"/>
+                <w14:ligatures w14:val="none"/>
+              </w:rPr>
+              <w:t>descriptive</w:t>
+            </w:r>
+            <w:r>
+              <w:rPr>
+                <w:rFonts w:ascii="Aptos Narrow" w:eastAsia="Times New Roman" w:hAnsi="Aptos Narrow" w:cs="Times New Roman"/>
+                <w:color w:val="000000"/>
+                <w:kern w:val="0"/>
+                <w:sz w:val="22"/>
+                <w:szCs w:val="22"/>
+                <w:lang w:eastAsia="en-GB"/>
+                <w14:ligatures w14:val="none"/>
+              </w:rPr>
+              <w:t xml:space="preserve"> and unique publication name that can be known before publication when project is created (same name as publication folder)</w:t>
+            </w:r>
+          </w:p>
+        </w:tc>
+      </w:tr>
+      <w:tr>
+        <w:trPr>
+          <w:trHeight w:val="300"/>
+        </w:trPr>
+        <w:tc>
+          <w:tcPr>
+            <w:tcW w:w="2587" w:type="dxa"/>
+            <w:noWrap/>
+          </w:tcPr>
+          <w:p>
+            <w:pPr>
+              <w:rPr>
+                <w:rFonts w:ascii="Aptos Narrow" w:eastAsia="Times New Roman" w:hAnsi="Aptos Narrow" w:cs="Times New Roman"/>
+                <w:color w:val="000000"/>
+                <w:kern w:val="0"/>
+                <w:sz w:val="22"/>
+                <w:szCs w:val="22"/>
+                <w:lang w:eastAsia="en-GB"/>
+                <w14:ligatures w14:val="none"/>
+              </w:rPr>
+            </w:pPr>
+            <w:r>
+              <w:rPr>
+                <w:rFonts w:ascii="Aptos Narrow" w:eastAsia="Times New Roman" w:hAnsi="Aptos Narrow" w:cs="Times New Roman"/>
+                <w:color w:val="000000"/>
+                <w:kern w:val="0"/>
+                <w:sz w:val="22"/>
+                <w:szCs w:val="22"/>
+                <w:lang w:eastAsia="en-GB"/>
+                <w14:ligatures w14:val="none"/>
+              </w:rPr>
+              <w:t>Working title</w:t>
+            </w:r>
+          </w:p>
+        </w:tc>
+        <w:tc>
+          <w:tcPr>
+            <w:tcW w:w="7059" w:type="dxa"/>
+            <w:noWrap/>
+          </w:tcPr>
+          <w:p>
+            <w:pPr>
+              <w:rPr>
+                <w:rFonts w:ascii="Aptos Narrow" w:eastAsia="Times New Roman" w:hAnsi="Aptos Narrow" w:cs="Times New Roman"/>
+                <w:color w:val="000000"/>
+                <w:kern w:val="0"/>
+                <w:sz w:val="22"/>
+                <w:szCs w:val="22"/>
+                <w:lang w:eastAsia="en-GB"/>
+                <w14:ligatures w14:val="none"/>
+              </w:rPr>
+            </w:pPr>
+            <w:r>
+              <w:rPr>
+                <w:rFonts w:ascii="Aptos Narrow" w:eastAsia="Times New Roman" w:hAnsi="Aptos Narrow" w:cs="Times New Roman"/>
+                <w:color w:val="000000"/>
+                <w:kern w:val="0"/>
+                <w:sz w:val="22"/>
+                <w:szCs w:val="22"/>
+                <w:lang w:eastAsia="en-GB"/>
+                <w14:ligatures w14:val="none"/>
+              </w:rPr>
+              <w:t>This filed can be dynamic up to the title of the final publication</w:t>
+            </w:r>
+          </w:p>
+        </w:tc>
+      </w:tr>
+      <w:tr>
+        <w:trPr>
+          <w:trHeight w:val="300"/>
+        </w:trPr>
+        <w:tc>
+          <w:tcPr>
+            <w:tcW w:w="2587" w:type="dxa"/>
+            <w:noWrap/>
+          </w:tcPr>
+          <w:p>
+            <w:pPr>
+              <w:rPr>
+                <w:rFonts w:ascii="Aptos Narrow" w:eastAsia="Times New Roman" w:hAnsi="Aptos Narrow" w:cs="Times New Roman"/>
+                <w:color w:val="000000"/>
+                <w:kern w:val="0"/>
+                <w:sz w:val="22"/>
+                <w:szCs w:val="22"/>
+                <w:lang w:eastAsia="en-GB"/>
+                <w14:ligatures w14:val="none"/>
+              </w:rPr>
+            </w:pPr>
+            <w:r>
+              <w:rPr>
+                <w:rFonts w:ascii="Aptos Narrow" w:eastAsia="Times New Roman" w:hAnsi="Aptos Narrow" w:cs="Times New Roman"/>
+                <w:color w:val="000000"/>
+                <w:kern w:val="0"/>
+                <w:sz w:val="22"/>
+                <w:szCs w:val="22"/>
+                <w:lang w:eastAsia="en-GB"/>
+                <w14:ligatures w14:val="none"/>
+              </w:rPr>
+              <w:t>status (in prep/submitted/published)</w:t>
+            </w:r>
+          </w:p>
+        </w:tc>
+        <w:tc>
+          <w:tcPr>
+            <w:tcW w:w="7059" w:type="dxa"/>
+            <w:noWrap/>
+          </w:tcPr>
+          <w:p>
+            <w:pPr>
+              <w:rPr>
+                <w:rFonts w:ascii="Aptos Narrow" w:eastAsia="Times New Roman" w:hAnsi="Aptos Narrow" w:cs="Times New Roman"/>
+                <w:color w:val="000000"/>
+                <w:kern w:val="0"/>
+                <w:sz w:val="22"/>
+                <w:szCs w:val="22"/>
+                <w:lang w:eastAsia="en-GB"/>
+                <w14:ligatures w14:val="none"/>
+              </w:rPr>
+            </w:pPr>
+            <w:r>
+              <w:rPr>
+                <w:rFonts w:ascii="Aptos Narrow" w:eastAsia="Times New Roman" w:hAnsi="Aptos Narrow" w:cs="Times New Roman"/>
+                <w:color w:val="000000"/>
+                <w:kern w:val="0"/>
+                <w:sz w:val="22"/>
+                <w:szCs w:val="22"/>
+                <w:lang w:eastAsia="en-GB"/>
+                <w14:ligatures w14:val="none"/>
+              </w:rPr>
+              <w:t>self-evident and manually updated</w:t>
+            </w:r>
+          </w:p>
+        </w:tc>
+      </w:tr>
+      <w:tr>
+        <w:trPr>
+          <w:trHeight w:val="300"/>
+        </w:trPr>
+        <w:tc>
+          <w:tcPr>
+            <w:tcW w:w="2587" w:type="dxa"/>
+            <w:noWrap/>
+          </w:tcPr>
+          <w:p>
+            <w:pPr>
+              <w:rPr>
+                <w:rFonts w:ascii="Aptos Narrow" w:eastAsia="Times New Roman" w:hAnsi="Aptos Narrow" w:cs="Times New Roman"/>
+                <w:color w:val="000000"/>
+                <w:kern w:val="0"/>
+                <w:sz w:val="22"/>
+                <w:szCs w:val="22"/>
+                <w:lang w:eastAsia="en-GB"/>
+                <w14:ligatures w14:val="none"/>
+              </w:rPr>
+            </w:pPr>
+            <w:r>
+              <w:rPr>
+                <w:rFonts w:ascii="Aptos Narrow" w:eastAsia="Times New Roman" w:hAnsi="Aptos Narrow" w:cs="Times New Roman"/>
+                <w:color w:val="000000"/>
+                <w:kern w:val="0"/>
+                <w:sz w:val="22"/>
+                <w:szCs w:val="22"/>
+                <w:lang w:eastAsia="en-GB"/>
+                <w14:ligatures w14:val="none"/>
+              </w:rPr>
+              <w:t>PI/corresponding author</w:t>
+            </w:r>
+          </w:p>
+        </w:tc>
+        <w:tc>
+          <w:tcPr>
+            <w:tcW w:w="7059" w:type="dxa"/>
+            <w:noWrap/>
+          </w:tcPr>
+          <w:p>
+            <w:pPr>
+              <w:rPr>
+                <w:rFonts w:ascii="Aptos Narrow" w:eastAsia="Times New Roman" w:hAnsi="Aptos Narrow" w:cs="Times New Roman"/>
+                <w:color w:val="000000"/>
+                <w:kern w:val="0"/>
+                <w:sz w:val="22"/>
+                <w:szCs w:val="22"/>
+                <w:lang w:eastAsia="en-GB"/>
+                <w14:ligatures w14:val="none"/>
+              </w:rPr>
+            </w:pPr>
+            <w:r>
+              <w:rPr>
+                <w:rFonts w:ascii="Aptos Narrow" w:eastAsia="Times New Roman" w:hAnsi="Aptos Narrow" w:cs="Times New Roman"/>
+                <w:color w:val="000000"/>
+                <w:kern w:val="0"/>
+                <w:sz w:val="22"/>
+                <w:szCs w:val="22"/>
+                <w:lang w:eastAsia="en-GB"/>
+                <w14:ligatures w14:val="none"/>
+              </w:rPr>
+              <w:t>self-evident and likely static</w:t>
+            </w:r>
+          </w:p>
+        </w:tc>
+      </w:tr>
+      <w:tr>
+        <w:trPr>
+          <w:trHeight w:val="300"/>
+        </w:trPr>
+        <w:tc>
+          <w:tcPr>
+            <w:tcW w:w="2587" w:type="dxa"/>
+            <w:noWrap/>
+          </w:tcPr>
+          <w:p>
+            <w:pPr>
+              <w:rPr>
+                <w:rFonts w:ascii="Aptos Narrow" w:eastAsia="Times New Roman" w:hAnsi="Aptos Narrow" w:cs="Times New Roman"/>
+                <w:color w:val="000000"/>
+                <w:kern w:val="0"/>
+                <w:sz w:val="22"/>
+                <w:szCs w:val="22"/>
+                <w:lang w:eastAsia="en-GB"/>
+                <w14:ligatures w14:val="none"/>
+              </w:rPr>
+            </w:pPr>
+            <w:r>
+              <w:rPr>
+                <w:rFonts w:ascii="Aptos Narrow" w:eastAsia="Times New Roman" w:hAnsi="Aptos Narrow" w:cs="Times New Roman"/>
+                <w:color w:val="000000"/>
+                <w:kern w:val="0"/>
+                <w:sz w:val="22"/>
+                <w:szCs w:val="22"/>
+                <w:lang w:eastAsia="en-GB"/>
+                <w14:ligatures w14:val="none"/>
+              </w:rPr>
+              <w:t>First author</w:t>
+            </w:r>
+          </w:p>
+        </w:tc>
+        <w:tc>
+          <w:tcPr>
+            <w:tcW w:w="7059" w:type="dxa"/>
+            <w:noWrap/>
+          </w:tcPr>
+          <w:p>
+            <w:pPr>
+              <w:rPr>
+                <w:rFonts w:ascii="Aptos Narrow" w:eastAsia="Times New Roman" w:hAnsi="Aptos Narrow" w:cs="Times New Roman"/>
+                <w:color w:val="000000"/>
+                <w:kern w:val="0"/>
+                <w:sz w:val="22"/>
+                <w:szCs w:val="22"/>
+                <w:lang w:eastAsia="en-GB"/>
+                <w14:ligatures w14:val="none"/>
+              </w:rPr>
+            </w:pPr>
+            <w:r>
+              <w:rPr>
+                <w:rFonts w:ascii="Aptos Narrow" w:eastAsia="Times New Roman" w:hAnsi="Aptos Narrow" w:cs="Times New Roman"/>
+                <w:color w:val="000000"/>
+                <w:kern w:val="0"/>
+                <w:sz w:val="22"/>
+                <w:szCs w:val="22"/>
+                <w:lang w:eastAsia="en-GB"/>
+                <w14:ligatures w14:val="none"/>
+              </w:rPr>
+              <w:t>self-evident and likely static</w:t>
+            </w:r>
+          </w:p>
+        </w:tc>
+      </w:tr>
+      <w:tr>
+        <w:trPr>
+          <w:trHeight w:val="300"/>
+        </w:trPr>
+        <w:tc>
+          <w:tcPr>
+            <w:tcW w:w="2587" w:type="dxa"/>
+            <w:noWrap/>
+          </w:tcPr>
+          <w:p>
+            <w:pPr>
+              <w:rPr>
+                <w:rFonts w:ascii="Aptos Narrow" w:eastAsia="Times New Roman" w:hAnsi="Aptos Narrow" w:cs="Times New Roman"/>
+                <w:color w:val="000000"/>
+                <w:kern w:val="0"/>
+                <w:sz w:val="22"/>
+                <w:szCs w:val="22"/>
+                <w:lang w:eastAsia="en-GB"/>
+                <w14:ligatures w14:val="none"/>
+              </w:rPr>
+            </w:pPr>
+            <w:r>
+              <w:rPr>
+                <w:rFonts w:ascii="Aptos Narrow" w:eastAsia="Times New Roman" w:hAnsi="Aptos Narrow" w:cs="Times New Roman"/>
+                <w:color w:val="000000"/>
+                <w:kern w:val="0"/>
+                <w:sz w:val="22"/>
+                <w:szCs w:val="22"/>
+                <w:lang w:eastAsia="en-GB"/>
+                <w14:ligatures w14:val="none"/>
+              </w:rPr>
+              <w:t>journal (optional), </w:t>
+            </w:r>
+          </w:p>
+        </w:tc>
+        <w:tc>
+          <w:tcPr>
+            <w:tcW w:w="7059" w:type="dxa"/>
+            <w:noWrap/>
+          </w:tcPr>
+          <w:p>
+            <w:pPr>
+              <w:rPr>
+                <w:rFonts w:ascii="Aptos Narrow" w:eastAsia="Times New Roman" w:hAnsi="Aptos Narrow" w:cs="Times New Roman"/>
+                <w:color w:val="000000"/>
+                <w:kern w:val="0"/>
+                <w:sz w:val="22"/>
+                <w:szCs w:val="22"/>
+                <w:lang w:eastAsia="en-GB"/>
+                <w14:ligatures w14:val="none"/>
+              </w:rPr>
+            </w:pPr>
+            <w:r>
+              <w:rPr>
+                <w:rFonts w:ascii="Aptos Narrow" w:eastAsia="Times New Roman" w:hAnsi="Aptos Narrow" w:cs="Times New Roman"/>
+                <w:color w:val="000000"/>
+                <w:kern w:val="0"/>
+                <w:sz w:val="22"/>
+                <w:szCs w:val="22"/>
+                <w:lang w:eastAsia="en-GB"/>
+                <w14:ligatures w14:val="none"/>
+              </w:rPr>
+              <w:t xml:space="preserve">target journal up to actual journal </w:t>
+            </w:r>
+          </w:p>
+        </w:tc>
+      </w:tr>
+      <w:tr>
+        <w:trPr>
+          <w:trHeight w:val="300"/>
+        </w:trPr>
+        <w:tc>
+          <w:tcPr>
+            <w:tcW w:w="2587" w:type="dxa"/>
+            <w:noWrap/>
+          </w:tcPr>
+          <w:p>
+            <w:pPr>
+              <w:rPr>
+                <w:rFonts w:ascii="Aptos Narrow" w:eastAsia="Times New Roman" w:hAnsi="Aptos Narrow" w:cs="Times New Roman"/>
+                <w:color w:val="000000"/>
+                <w:kern w:val="0"/>
+                <w:sz w:val="22"/>
+                <w:szCs w:val="22"/>
+                <w:lang w:eastAsia="en-GB"/>
+                <w14:ligatures w14:val="none"/>
+              </w:rPr>
+            </w:pPr>
+            <w:r>
+              <w:rPr>
+                <w:rFonts w:ascii="Aptos Narrow" w:eastAsia="Times New Roman" w:hAnsi="Aptos Narrow" w:cs="Times New Roman"/>
+                <w:color w:val="000000"/>
+                <w:kern w:val="0"/>
+                <w:sz w:val="22"/>
+                <w:szCs w:val="22"/>
+                <w:lang w:eastAsia="en-GB"/>
+                <w14:ligatures w14:val="none"/>
+              </w:rPr>
+              <w:t>DOI</w:t>
+            </w:r>
+          </w:p>
+        </w:tc>
+        <w:tc>
+          <w:tcPr>
+            <w:tcW w:w="7059" w:type="dxa"/>
+            <w:noWrap/>
+          </w:tcPr>
+          <w:p>
+            <w:pPr>
+              <w:rPr>
+                <w:rFonts w:ascii="Aptos Narrow" w:eastAsia="Times New Roman" w:hAnsi="Aptos Narrow" w:cs="Times New Roman"/>
+                <w:color w:val="000000"/>
+                <w:kern w:val="0"/>
+                <w:sz w:val="22"/>
+                <w:szCs w:val="22"/>
+                <w:lang w:eastAsia="en-GB"/>
+                <w14:ligatures w14:val="none"/>
+              </w:rPr>
+            </w:pPr>
+            <w:r>
+              <w:rPr>
+                <w:rFonts w:ascii="Aptos Narrow" w:eastAsia="Times New Roman" w:hAnsi="Aptos Narrow" w:cs="Times New Roman"/>
+                <w:color w:val="000000"/>
+                <w:kern w:val="0"/>
+                <w:sz w:val="22"/>
+                <w:szCs w:val="22"/>
+                <w:lang w:eastAsia="en-GB"/>
+                <w14:ligatures w14:val="none"/>
+              </w:rPr>
+              <w:t>manually added when available</w:t>
+            </w:r>
+          </w:p>
+        </w:tc>
+      </w:tr>
+      <w:tr>
+        <w:trPr>
+          <w:trHeight w:val="300"/>
+        </w:trPr>
+        <w:tc>
+          <w:tcPr>
+            <w:tcW w:w="2587" w:type="dxa"/>
+            <w:noWrap/>
+          </w:tcPr>
+          <w:p>
+            <w:pPr>
+              <w:rPr>
+                <w:rFonts w:ascii="Aptos Narrow" w:eastAsia="Times New Roman" w:hAnsi="Aptos Narrow" w:cs="Times New Roman"/>
+                <w:color w:val="000000"/>
+                <w:kern w:val="0"/>
+                <w:sz w:val="22"/>
+                <w:szCs w:val="22"/>
+                <w:lang w:eastAsia="en-GB"/>
+                <w14:ligatures w14:val="none"/>
+              </w:rPr>
+            </w:pPr>
+            <w:r>
+              <w:rPr>
+                <w:rFonts w:ascii="Aptos Narrow" w:eastAsia="Times New Roman" w:hAnsi="Aptos Narrow" w:cs="Times New Roman"/>
+                <w:color w:val="000000"/>
+                <w:kern w:val="0"/>
+                <w:sz w:val="22"/>
+                <w:szCs w:val="22"/>
+                <w:lang w:eastAsia="en-GB"/>
+                <w14:ligatures w14:val="none"/>
+              </w:rPr>
+              <w:t>Folder location</w:t>
+            </w:r>
+          </w:p>
+        </w:tc>
+        <w:tc>
+          <w:tcPr>
+            <w:tcW w:w="7059" w:type="dxa"/>
+            <w:noWrap/>
+          </w:tcPr>
+          <w:p>
+            <w:pPr>
+              <w:rPr>
+                <w:rFonts w:ascii="Aptos Narrow" w:eastAsia="Times New Roman" w:hAnsi="Aptos Narrow" w:cs="Times New Roman"/>
+                <w:color w:val="000000"/>
+                <w:kern w:val="0"/>
+                <w:sz w:val="22"/>
+                <w:szCs w:val="22"/>
+                <w:lang w:eastAsia="en-GB"/>
+                <w14:ligatures w14:val="none"/>
+              </w:rPr>
+            </w:pPr>
+            <w:r>
+              <w:rPr>
+                <w:rFonts w:ascii="Aptos Narrow" w:eastAsia="Times New Roman" w:hAnsi="Aptos Narrow" w:cs="Times New Roman"/>
+                <w:color w:val="000000"/>
+                <w:kern w:val="0"/>
+                <w:sz w:val="22"/>
+                <w:szCs w:val="22"/>
+                <w:lang w:eastAsia="en-GB"/>
+                <w14:ligatures w14:val="none"/>
+              </w:rPr>
+              <w:t>In the beginning it will be in gjesus3/publication/&lt;short name&gt; but after a set time it will be moved to offline media or cold cloud storage, but the registry entry will remain</w:t>
+            </w:r>
+          </w:p>
+        </w:tc>
+      </w:tr>
+      <w:tr>
+        <w:trPr>
+          <w:trHeight w:val="300"/>
+        </w:trPr>
+        <w:tc>
+          <w:tcPr>
+            <w:tcW w:w="2587" w:type="dxa"/>
+            <w:noWrap/>
+          </w:tcPr>
+          <w:p>
+            <w:pPr>
+              <w:rPr>
+                <w:rFonts w:ascii="Aptos Narrow" w:eastAsia="Times New Roman" w:hAnsi="Aptos Narrow" w:cs="Times New Roman"/>
+                <w:color w:val="000000"/>
+                <w:kern w:val="0"/>
+                <w:sz w:val="22"/>
+                <w:szCs w:val="22"/>
+                <w:lang w:eastAsia="en-GB"/>
+                <w14:ligatures w14:val="none"/>
+              </w:rPr>
+            </w:pPr>
+            <w:r>
+              <w:rPr>
+                <w:rFonts w:ascii="Aptos Narrow" w:eastAsia="Times New Roman" w:hAnsi="Aptos Narrow" w:cs="Times New Roman"/>
+                <w:color w:val="000000"/>
+                <w:kern w:val="0"/>
+                <w:sz w:val="22"/>
+                <w:szCs w:val="22"/>
+                <w:lang w:eastAsia="en-GB"/>
+                <w14:ligatures w14:val="none"/>
+              </w:rPr>
+              <w:t xml:space="preserve">Repository </w:t>
+            </w:r>
+          </w:p>
+        </w:tc>
+        <w:tc>
+          <w:tcPr>
+            <w:tcW w:w="7059" w:type="dxa"/>
+            <w:noWrap/>
+          </w:tcPr>
+          <w:p>
+            <w:pPr>
+              <w:rPr>
+                <w:rFonts w:ascii="Aptos Narrow" w:eastAsia="Times New Roman" w:hAnsi="Aptos Narrow" w:cs="Times New Roman"/>
+                <w:color w:val="000000"/>
+                <w:kern w:val="0"/>
+                <w:sz w:val="22"/>
+                <w:szCs w:val="22"/>
+                <w:lang w:eastAsia="en-GB"/>
+                <w14:ligatures w14:val="none"/>
+              </w:rPr>
+            </w:pPr>
+            <w:r>
+              <w:rPr>
+                <w:rFonts w:ascii="Aptos Narrow" w:eastAsia="Times New Roman" w:hAnsi="Aptos Narrow" w:cs="Times New Roman"/>
+                <w:color w:val="000000"/>
+                <w:kern w:val="0"/>
+                <w:sz w:val="22"/>
+                <w:szCs w:val="22"/>
+                <w:lang w:eastAsia="en-GB"/>
+                <w14:ligatures w14:val="none"/>
+              </w:rPr>
+              <w:t>DOI or link to any other repository where the data was put (Zenodo in our case)</w:t>
+            </w:r>
+          </w:p>
+        </w:tc>
+      </w:tr>
+      <w:tr>
+        <w:trPr>
+          <w:trHeight w:val="300"/>
+        </w:trPr>
+        <w:tc>
+          <w:tcPr>
+            <w:tcW w:w="2587" w:type="dxa"/>
+            <w:noWrap/>
+          </w:tcPr>
+          <w:p>
+            <w:pPr>
+              <w:rPr>
+                <w:rFonts w:ascii="Aptos Narrow" w:eastAsia="Times New Roman" w:hAnsi="Aptos Narrow" w:cs="Times New Roman"/>
+                <w:color w:val="000000"/>
+                <w:kern w:val="0"/>
+                <w:sz w:val="22"/>
+                <w:szCs w:val="22"/>
+                <w:lang w:eastAsia="en-GB"/>
+                <w14:ligatures w14:val="none"/>
+              </w:rPr>
+            </w:pPr>
+            <w:r>
+              <w:rPr>
+                <w:rFonts w:ascii="Aptos Narrow" w:eastAsia="Times New Roman" w:hAnsi="Aptos Narrow" w:cs="Times New Roman"/>
+                <w:color w:val="000000"/>
+                <w:kern w:val="0"/>
+                <w:sz w:val="22"/>
+                <w:szCs w:val="22"/>
+                <w:lang w:eastAsia="en-GB"/>
+                <w14:ligatures w14:val="none"/>
+              </w:rPr>
+              <w:t xml:space="preserve"> Created date</w:t>
+            </w:r>
+          </w:p>
+        </w:tc>
+        <w:tc>
+          <w:tcPr>
+            <w:tcW w:w="7059" w:type="dxa"/>
+            <w:noWrap/>
+          </w:tcPr>
+          <w:p>
+            <w:pPr>
+              <w:rPr>
+                <w:rFonts w:ascii="Aptos Narrow" w:eastAsia="Times New Roman" w:hAnsi="Aptos Narrow" w:cs="Times New Roman"/>
+                <w:color w:val="000000"/>
+                <w:kern w:val="0"/>
+                <w:sz w:val="22"/>
+                <w:szCs w:val="22"/>
+                <w:lang w:eastAsia="en-GB"/>
+                <w14:ligatures w14:val="none"/>
+              </w:rPr>
+            </w:pPr>
+            <w:r>
+              <w:rPr>
+                <w:rFonts w:ascii="Aptos Narrow" w:eastAsia="Times New Roman" w:hAnsi="Aptos Narrow" w:cs="Times New Roman"/>
+                <w:color w:val="000000"/>
+                <w:kern w:val="0"/>
+                <w:sz w:val="22"/>
+                <w:szCs w:val="22"/>
+                <w:lang w:eastAsia="en-GB"/>
+                <w14:ligatures w14:val="none"/>
+              </w:rPr>
+              <w:t xml:space="preserve">When was the folder and registration created </w:t>
+            </w:r>
+          </w:p>
+        </w:tc>
+      </w:tr>
+      <w:tr>
+        <w:trPr>
+          <w:trHeight w:val="300"/>
+        </w:trPr>
+        <w:tc>
+          <w:tcPr>
+            <w:tcW w:w="2587" w:type="dxa"/>
+            <w:noWrap/>
+            <w:hideMark/>
+          </w:tcPr>
+          <w:p>
+            <w:pPr>
+              <w:rPr>
+                <w:rFonts w:ascii="Aptos Narrow" w:eastAsia="Times New Roman" w:hAnsi="Aptos Narrow" w:cs="Times New Roman"/>
+                <w:color w:val="000000"/>
+                <w:kern w:val="0"/>
+                <w:sz w:val="22"/>
+                <w:szCs w:val="22"/>
+                <w:lang w:eastAsia="en-GB"/>
+                <w14:ligatures w14:val="none"/>
+              </w:rPr>
+            </w:pPr>
+            <w:r>
+              <w:rPr>
+                <w:rFonts w:ascii="Aptos Narrow" w:eastAsia="Times New Roman" w:hAnsi="Aptos Narrow" w:cs="Times New Roman"/>
+                <w:color w:val="000000"/>
+                <w:kern w:val="0"/>
+                <w:sz w:val="22"/>
+                <w:szCs w:val="22"/>
+                <w:lang w:eastAsia="en-GB"/>
+                <w14:ligatures w14:val="none"/>
+              </w:rPr>
+              <w:t>Closed date</w:t>
+            </w:r>
+          </w:p>
+        </w:tc>
+        <w:tc>
+          <w:tcPr>
+            <w:tcW w:w="7059" w:type="dxa"/>
+            <w:noWrap/>
+            <w:hideMark/>
+          </w:tcPr>
+          <w:p>
+            <w:pPr>
+              <w:rPr>
+                <w:rFonts w:ascii="Aptos Narrow" w:eastAsia="Times New Roman" w:hAnsi="Aptos Narrow" w:cs="Times New Roman"/>
+                <w:color w:val="000000"/>
+                <w:kern w:val="0"/>
+                <w:sz w:val="22"/>
+                <w:szCs w:val="22"/>
+                <w:lang w:eastAsia="en-GB"/>
+                <w14:ligatures w14:val="none"/>
+              </w:rPr>
+            </w:pPr>
+            <w:r>
+              <w:rPr>
+                <w:rFonts w:ascii="Aptos Narrow" w:eastAsia="Times New Roman" w:hAnsi="Aptos Narrow" w:cs="Times New Roman"/>
+                <w:color w:val="000000"/>
+                <w:kern w:val="0"/>
+                <w:sz w:val="22"/>
+                <w:szCs w:val="22"/>
+                <w:lang w:eastAsia="en-GB"/>
+                <w14:ligatures w14:val="none"/>
+              </w:rPr>
+              <w:t>When was it published or otherwise terminated</w:t>
+            </w:r>
+          </w:p>
+        </w:tc>
+      </w:tr>
+    </w:tbl>
+    <w:p>
+      <w:r>
+        <w:t>Others?</w:t>
+      </w:r>
+    </w:p>
+    <w:p>
+      <w:r>
+        <w:t>Are there other fields you would like to see?</w:t>
+      </w:r>
+    </w:p>
+    <w:p>
+      <w:pPr>
+        <w:pStyle w:val="ListParagraph"/>
+        <w:numPr>
+          <w:ilvl w:val="0"/>
+          <w:numId w:val="2"/>
+        </w:numPr>
+      </w:pPr>
+      <w:commentRangeStart w:id="3"/>
+      <w:r>
+        <w:t>Other fields???</w:t>
+      </w:r>
+      <w:commentRangeEnd w:id="3"/>
+      <w:r>
+        <w:rPr>
+          <w:rStyle w:val="CommentReference"/>
+          <w:sz w:val="24"/>
+          <w:szCs w:val="24"/>
+        </w:rPr>
+        <w:commentReference w:id="3"/>
+      </w:r>
+    </w:p>
+    <w:p>
+      <w:pPr>
+        <w:pStyle w:val="Heading3"/>
+      </w:pPr>
+      <w:r>
+        <w:t xml:space="preserve">Projects </w:t>
+      </w:r>
+    </w:p>
+    <w:p>
+      <w:r>
+        <w:t>We still need to d</w:t>
+      </w:r>
+      <w:r>
+        <w:t>efine what “a project” means for this pilot (even if fuzzy): expected use cases and anti-patterns</w:t>
+      </w:r>
+      <w:r>
+        <w:t xml:space="preserve">. What is expected is that there will be a lot of flexibility with the structure of this dir. Despite the internal structure, project folders will also enforce </w:t>
+      </w:r>
+      <w:r>
+        <w:t>data provenance</w:t>
+      </w:r>
+      <w:r>
+        <w:t xml:space="preserve"> recording (described elsewhere) so we can track where each file came from. Projects will be temporary and may be migrated to publications, external drives or just erased after a set time period.</w:t>
       </w:r>
     </w:p>
     <w:p>
@@ -2026,7 +2705,7 @@
                 <w14:ligatures w14:val="none"/>
               </w:rPr>
             </w:pPr>
-            <w:commentRangeStart w:id="2"/>
+            <w:commentRangeStart w:id="4"/>
             <w:r>
               <w:rPr>
                 <w:rFonts w:ascii="Aptos Narrow" w:eastAsia="Times New Roman" w:hAnsi="Aptos Narrow" w:cs="Times New Roman"/>
@@ -2041,7 +2720,7 @@
               </w:rPr>
               <w:t>Field</w:t>
             </w:r>
-            <w:commentRangeEnd w:id="2"/>
+            <w:commentRangeEnd w:id="4"/>
             <w:r>
               <w:rPr>
                 <w:rStyle w:val="CommentReference"/>
@@ -2055,7 +2734,7 @@
                 <w:lang w:eastAsia="en-GB"/>
                 <w14:ligatures w14:val="none"/>
               </w:rPr>
-              <w:commentReference w:id="2"/>
+              <w:commentReference w:id="4"/>
             </w:r>
           </w:p>
         </w:tc>
@@ -2119,16 +2798,7 @@
               </w:rPr>
             </w:pPr>
             <w:r>
-              <w:rPr>
-                <w:rFonts w:ascii="Aptos Narrow" w:eastAsia="Times New Roman" w:hAnsi="Aptos Narrow" w:cs="Times New Roman"/>
-                <w:color w:val="000000"/>
-                <w:kern w:val="0"/>
-                <w:sz w:val="22"/>
-                <w:szCs w:val="22"/>
-                <w:lang w:eastAsia="en-GB"/>
-                <w14:ligatures w14:val="none"/>
-              </w:rPr>
-              <w:t>PubID</w:t>
+              <w:t>ProjectID</w:t>
             </w:r>
           </w:p>
         </w:tc>
@@ -2171,19 +2841,43 @@
                 <w:lang w:eastAsia="en-GB"/>
                 <w14:ligatures w14:val="none"/>
               </w:rPr>
-              <w:t>publication</w:t>
-            </w:r>
-            <w:r>
-              <w:rPr>
-                <w:rFonts w:ascii="Aptos Narrow" w:eastAsia="Times New Roman" w:hAnsi="Aptos Narrow" w:cs="Times New Roman"/>
-                <w:color w:val="000000"/>
-                <w:kern w:val="0"/>
-                <w:sz w:val="22"/>
-                <w:szCs w:val="22"/>
-                <w:lang w:eastAsia="en-GB"/>
-                <w14:ligatures w14:val="none"/>
-              </w:rPr>
-              <w:t xml:space="preserve">, likely a counter, e.g. PUB-0001 </w:t>
+              <w:t>project</w:t>
+            </w:r>
+            <w:r>
+              <w:rPr>
+                <w:rFonts w:ascii="Aptos Narrow" w:eastAsia="Times New Roman" w:hAnsi="Aptos Narrow" w:cs="Times New Roman"/>
+                <w:color w:val="000000"/>
+                <w:kern w:val="0"/>
+                <w:sz w:val="22"/>
+                <w:szCs w:val="22"/>
+                <w:lang w:eastAsia="en-GB"/>
+                <w14:ligatures w14:val="none"/>
+              </w:rPr>
+              <w:t xml:space="preserve">, likely a counter, e.g. </w:t>
+            </w:r>
+            <w:r>
+              <w:rPr>
+                <w:rFonts w:ascii="Aptos Narrow" w:eastAsia="Times New Roman" w:hAnsi="Aptos Narrow" w:cs="Times New Roman"/>
+                <w:color w:val="000000"/>
+                <w:kern w:val="0"/>
+                <w:sz w:val="22"/>
+                <w:szCs w:val="22"/>
+                <w:lang w:eastAsia="en-GB"/>
+                <w14:ligatures w14:val="none"/>
+              </w:rPr>
+              <w:t>PROJ</w:t>
+            </w:r>
+            <w:r>
+              <w:rPr>
+                <w:rFonts w:ascii="Aptos Narrow" w:eastAsia="Times New Roman" w:hAnsi="Aptos Narrow" w:cs="Times New Roman"/>
+                <w:color w:val="000000"/>
+                <w:kern w:val="0"/>
+                <w:sz w:val="22"/>
+                <w:szCs w:val="22"/>
+                <w:lang w:eastAsia="en-GB"/>
+                <w14:ligatures w14:val="none"/>
+              </w:rPr>
+              <w:t xml:space="preserve">-0001 </w:t>
             </w:r>
           </w:p>
         </w:tc>
@@ -2250,31 +2944,7 @@
                 <w:lang w:eastAsia="en-GB"/>
                 <w14:ligatures w14:val="none"/>
               </w:rPr>
-              <w:t xml:space="preserve">Short but </w:t>
-            </w:r>
-            <w:r>
-              <w:rPr>
-                <w:rFonts w:ascii="Aptos Narrow" w:eastAsia="Times New Roman" w:hAnsi="Aptos Narrow" w:cs="Times New Roman"/>
-                <w:color w:val="000000"/>
-                <w:kern w:val="0"/>
-                <w:sz w:val="22"/>
-                <w:szCs w:val="22"/>
-                <w:lang w:eastAsia="en-GB"/>
-                <w14:ligatures w14:val="none"/>
-              </w:rPr>
-              <w:t>descriptive</w:t>
-            </w:r>
-            <w:r>
-              <w:rPr>
-                <w:rFonts w:ascii="Aptos Narrow" w:eastAsia="Times New Roman" w:hAnsi="Aptos Narrow" w:cs="Times New Roman"/>
-                <w:color w:val="000000"/>
-                <w:kern w:val="0"/>
-                <w:sz w:val="22"/>
-                <w:szCs w:val="22"/>
-                <w:lang w:eastAsia="en-GB"/>
-                <w14:ligatures w14:val="none"/>
-              </w:rPr>
-              <w:t xml:space="preserve"> and unique publication name that can be known before publication when project is created (same name as publication folder)</w:t>
+              <w:t>Short but descriptive and unique publication name that can be known before publication when project is created (same name as publication folder)</w:t>
             </w:r>
           </w:p>
         </w:tc>
@@ -2301,16 +2971,7 @@
               </w:rPr>
             </w:pPr>
             <w:r>
-              <w:rPr>
-                <w:rFonts w:ascii="Aptos Narrow" w:eastAsia="Times New Roman" w:hAnsi="Aptos Narrow" w:cs="Times New Roman"/>
-                <w:color w:val="000000"/>
-                <w:kern w:val="0"/>
-                <w:sz w:val="22"/>
-                <w:szCs w:val="22"/>
-                <w:lang w:eastAsia="en-GB"/>
-                <w14:ligatures w14:val="none"/>
-              </w:rPr>
-              <w:t>Working title</w:t>
+              <w:t>description</w:t>
             </w:r>
           </w:p>
         </w:tc>
@@ -2341,19 +3002,7 @@
                 <w:lang w:eastAsia="en-GB"/>
                 <w14:ligatures w14:val="none"/>
               </w:rPr>
-              <w:t xml:space="preserve">This filed can be dynamic up to the title of the final </w:t>
-            </w:r>
-            <w:r>
-              <w:rPr>
-                <w:rFonts w:ascii="Aptos Narrow" w:eastAsia="Times New Roman" w:hAnsi="Aptos Narrow" w:cs="Times New Roman"/>
-                <w:color w:val="000000"/>
-                <w:kern w:val="0"/>
-                <w:sz w:val="22"/>
-                <w:szCs w:val="22"/>
-                <w:lang w:eastAsia="en-GB"/>
-                <w14:ligatures w14:val="none"/>
-              </w:rPr>
-              <w:t>publication</w:t>
+              <w:t>This filed can be dynamic up to the title of the final publication</w:t>
             </w:r>
           </w:p>
         </w:tc>
@@ -2380,16 +3029,7 @@
               </w:rPr>
             </w:pPr>
             <w:r>
-              <w:rPr>
-                <w:rFonts w:ascii="Aptos Narrow" w:eastAsia="Times New Roman" w:hAnsi="Aptos Narrow" w:cs="Times New Roman"/>
-                <w:color w:val="000000"/>
-                <w:kern w:val="0"/>
-                <w:sz w:val="22"/>
-                <w:szCs w:val="22"/>
-                <w:lang w:eastAsia="en-GB"/>
-                <w14:ligatures w14:val="none"/>
-              </w:rPr>
-              <w:t>status (in prep/submitted/published)</w:t>
+              <w:t>SPOC/owner</w:t>
             </w:r>
           </w:p>
         </w:tc>
@@ -2420,19 +3060,7 @@
                 <w:lang w:eastAsia="en-GB"/>
                 <w14:ligatures w14:val="none"/>
               </w:rPr>
-              <w:t>self-evident</w:t>
-            </w:r>
-            <w:r>
-              <w:rPr>
-                <w:rFonts w:ascii="Aptos Narrow" w:eastAsia="Times New Roman" w:hAnsi="Aptos Narrow" w:cs="Times New Roman"/>
-                <w:color w:val="000000"/>
-                <w:kern w:val="0"/>
-                <w:sz w:val="22"/>
-                <w:szCs w:val="22"/>
-                <w:lang w:eastAsia="en-GB"/>
-                <w14:ligatures w14:val="none"/>
-              </w:rPr>
-              <w:t xml:space="preserve"> and manually updated</w:t>
+              <w:t>self-evident and manually updated</w:t>
             </w:r>
           </w:p>
         </w:tc>
@@ -2459,1091 +3087,7 @@
               </w:rPr>
             </w:pPr>
             <w:r>
-              <w:rPr>
-                <w:rFonts w:ascii="Aptos Narrow" w:eastAsia="Times New Roman" w:hAnsi="Aptos Narrow" w:cs="Times New Roman"/>
-                <w:color w:val="000000"/>
-                <w:kern w:val="0"/>
-                <w:sz w:val="22"/>
-                <w:szCs w:val="22"/>
-                <w:lang w:eastAsia="en-GB"/>
-                <w14:ligatures w14:val="none"/>
-              </w:rPr>
-              <w:t>PI/corresponding author</w:t>
-            </w:r>
-          </w:p>
-        </w:tc>
-        <w:tc>
-          <w:tcPr>
-            <w:tcW w:w="7059" w:type="dxa"/>
-            <w:noWrap/>
-          </w:tcPr>
-          <w:p>
-            <w:pPr>
-              <w:rPr>
-                <w:rFonts w:ascii="Aptos Narrow" w:eastAsia="Times New Roman" w:hAnsi="Aptos Narrow" w:cs="Times New Roman"/>
-                <w:color w:val="000000"/>
-                <w:kern w:val="0"/>
-                <w:sz w:val="22"/>
-                <w:szCs w:val="22"/>
-                <w:lang w:eastAsia="en-GB"/>
-                <w14:ligatures w14:val="none"/>
-              </w:rPr>
-            </w:pPr>
-            <w:r>
-              <w:rPr>
-                <w:rFonts w:ascii="Aptos Narrow" w:eastAsia="Times New Roman" w:hAnsi="Aptos Narrow" w:cs="Times New Roman"/>
-                <w:color w:val="000000"/>
-                <w:kern w:val="0"/>
-                <w:sz w:val="22"/>
-                <w:szCs w:val="22"/>
-                <w:lang w:eastAsia="en-GB"/>
-                <w14:ligatures w14:val="none"/>
-              </w:rPr>
-              <w:t>self-evident</w:t>
-            </w:r>
-            <w:r>
-              <w:rPr>
-                <w:rFonts w:ascii="Aptos Narrow" w:eastAsia="Times New Roman" w:hAnsi="Aptos Narrow" w:cs="Times New Roman"/>
-                <w:color w:val="000000"/>
-                <w:kern w:val="0"/>
-                <w:sz w:val="22"/>
-                <w:szCs w:val="22"/>
-                <w:lang w:eastAsia="en-GB"/>
-                <w14:ligatures w14:val="none"/>
-              </w:rPr>
-              <w:t xml:space="preserve"> and likely static</w:t>
-            </w:r>
-          </w:p>
-        </w:tc>
-      </w:tr>
-      <w:tr>
-        <w:trPr>
-          <w:trHeight w:val="300"/>
-        </w:trPr>
-        <w:tc>
-          <w:tcPr>
-            <w:tcW w:w="2587" w:type="dxa"/>
-            <w:noWrap/>
-          </w:tcPr>
-          <w:p>
-            <w:pPr>
-              <w:rPr>
-                <w:rFonts w:ascii="Aptos Narrow" w:eastAsia="Times New Roman" w:hAnsi="Aptos Narrow" w:cs="Times New Roman"/>
-                <w:color w:val="000000"/>
-                <w:kern w:val="0"/>
-                <w:sz w:val="22"/>
-                <w:szCs w:val="22"/>
-                <w:lang w:eastAsia="en-GB"/>
-                <w14:ligatures w14:val="none"/>
-              </w:rPr>
-            </w:pPr>
-            <w:r>
-              <w:rPr>
-                <w:rFonts w:ascii="Aptos Narrow" w:eastAsia="Times New Roman" w:hAnsi="Aptos Narrow" w:cs="Times New Roman"/>
-                <w:color w:val="000000"/>
-                <w:kern w:val="0"/>
-                <w:sz w:val="22"/>
-                <w:szCs w:val="22"/>
-                <w:lang w:eastAsia="en-GB"/>
-                <w14:ligatures w14:val="none"/>
-              </w:rPr>
-              <w:t>First author</w:t>
-            </w:r>
-          </w:p>
-        </w:tc>
-        <w:tc>
-          <w:tcPr>
-            <w:tcW w:w="7059" w:type="dxa"/>
-            <w:noWrap/>
-          </w:tcPr>
-          <w:p>
-            <w:pPr>
-              <w:rPr>
-                <w:rFonts w:ascii="Aptos Narrow" w:eastAsia="Times New Roman" w:hAnsi="Aptos Narrow" w:cs="Times New Roman"/>
-                <w:color w:val="000000"/>
-                <w:kern w:val="0"/>
-                <w:sz w:val="22"/>
-                <w:szCs w:val="22"/>
-                <w:lang w:eastAsia="en-GB"/>
-                <w14:ligatures w14:val="none"/>
-              </w:rPr>
-            </w:pPr>
-            <w:r>
-              <w:rPr>
-                <w:rFonts w:ascii="Aptos Narrow" w:eastAsia="Times New Roman" w:hAnsi="Aptos Narrow" w:cs="Times New Roman"/>
-                <w:color w:val="000000"/>
-                <w:kern w:val="0"/>
-                <w:sz w:val="22"/>
-                <w:szCs w:val="22"/>
-                <w:lang w:eastAsia="en-GB"/>
-                <w14:ligatures w14:val="none"/>
-              </w:rPr>
-              <w:t>self-evident</w:t>
-            </w:r>
-            <w:r>
-              <w:rPr>
-                <w:rFonts w:ascii="Aptos Narrow" w:eastAsia="Times New Roman" w:hAnsi="Aptos Narrow" w:cs="Times New Roman"/>
-                <w:color w:val="000000"/>
-                <w:kern w:val="0"/>
-                <w:sz w:val="22"/>
-                <w:szCs w:val="22"/>
-                <w:lang w:eastAsia="en-GB"/>
-                <w14:ligatures w14:val="none"/>
-              </w:rPr>
-              <w:t xml:space="preserve"> and likely static</w:t>
-            </w:r>
-          </w:p>
-        </w:tc>
-      </w:tr>
-      <w:tr>
-        <w:trPr>
-          <w:trHeight w:val="300"/>
-        </w:trPr>
-        <w:tc>
-          <w:tcPr>
-            <w:tcW w:w="2587" w:type="dxa"/>
-            <w:noWrap/>
-          </w:tcPr>
-          <w:p>
-            <w:pPr>
-              <w:rPr>
-                <w:rFonts w:ascii="Aptos Narrow" w:eastAsia="Times New Roman" w:hAnsi="Aptos Narrow" w:cs="Times New Roman"/>
-                <w:color w:val="000000"/>
-                <w:kern w:val="0"/>
-                <w:sz w:val="22"/>
-                <w:szCs w:val="22"/>
-                <w:lang w:eastAsia="en-GB"/>
-                <w14:ligatures w14:val="none"/>
-              </w:rPr>
-            </w:pPr>
-            <w:r>
-              <w:rPr>
-                <w:rFonts w:ascii="Aptos Narrow" w:eastAsia="Times New Roman" w:hAnsi="Aptos Narrow" w:cs="Times New Roman"/>
-                <w:color w:val="000000"/>
-                <w:kern w:val="0"/>
-                <w:sz w:val="22"/>
-                <w:szCs w:val="22"/>
-                <w:lang w:eastAsia="en-GB"/>
-                <w14:ligatures w14:val="none"/>
-              </w:rPr>
-              <w:t>journal (optional), </w:t>
-            </w:r>
-          </w:p>
-        </w:tc>
-        <w:tc>
-          <w:tcPr>
-            <w:tcW w:w="7059" w:type="dxa"/>
-            <w:noWrap/>
-          </w:tcPr>
-          <w:p>
-            <w:pPr>
-              <w:rPr>
-                <w:rFonts w:ascii="Aptos Narrow" w:eastAsia="Times New Roman" w:hAnsi="Aptos Narrow" w:cs="Times New Roman"/>
-                <w:color w:val="000000"/>
-                <w:kern w:val="0"/>
-                <w:sz w:val="22"/>
-                <w:szCs w:val="22"/>
-                <w:lang w:eastAsia="en-GB"/>
-                <w14:ligatures w14:val="none"/>
-              </w:rPr>
-            </w:pPr>
-            <w:r>
-              <w:rPr>
-                <w:rFonts w:ascii="Aptos Narrow" w:eastAsia="Times New Roman" w:hAnsi="Aptos Narrow" w:cs="Times New Roman"/>
-                <w:color w:val="000000"/>
-                <w:kern w:val="0"/>
-                <w:sz w:val="22"/>
-                <w:szCs w:val="22"/>
-                <w:lang w:eastAsia="en-GB"/>
-                <w14:ligatures w14:val="none"/>
-              </w:rPr>
-              <w:t xml:space="preserve">target journal up to actual journal </w:t>
-            </w:r>
-          </w:p>
-        </w:tc>
-      </w:tr>
-      <w:tr>
-        <w:trPr>
-          <w:trHeight w:val="300"/>
-        </w:trPr>
-        <w:tc>
-          <w:tcPr>
-            <w:tcW w:w="2587" w:type="dxa"/>
-            <w:noWrap/>
-          </w:tcPr>
-          <w:p>
-            <w:pPr>
-              <w:rPr>
-                <w:rFonts w:ascii="Aptos Narrow" w:eastAsia="Times New Roman" w:hAnsi="Aptos Narrow" w:cs="Times New Roman"/>
-                <w:color w:val="000000"/>
-                <w:kern w:val="0"/>
-                <w:sz w:val="22"/>
-                <w:szCs w:val="22"/>
-                <w:lang w:eastAsia="en-GB"/>
-                <w14:ligatures w14:val="none"/>
-              </w:rPr>
-            </w:pPr>
-            <w:r>
-              <w:rPr>
-                <w:rFonts w:ascii="Aptos Narrow" w:eastAsia="Times New Roman" w:hAnsi="Aptos Narrow" w:cs="Times New Roman"/>
-                <w:color w:val="000000"/>
-                <w:kern w:val="0"/>
-                <w:sz w:val="22"/>
-                <w:szCs w:val="22"/>
-                <w:lang w:eastAsia="en-GB"/>
-                <w14:ligatures w14:val="none"/>
-              </w:rPr>
-              <w:t>DOI</w:t>
-            </w:r>
-          </w:p>
-        </w:tc>
-        <w:tc>
-          <w:tcPr>
-            <w:tcW w:w="7059" w:type="dxa"/>
-            <w:noWrap/>
-          </w:tcPr>
-          <w:p>
-            <w:pPr>
-              <w:rPr>
-                <w:rFonts w:ascii="Aptos Narrow" w:eastAsia="Times New Roman" w:hAnsi="Aptos Narrow" w:cs="Times New Roman"/>
-                <w:color w:val="000000"/>
-                <w:kern w:val="0"/>
-                <w:sz w:val="22"/>
-                <w:szCs w:val="22"/>
-                <w:lang w:eastAsia="en-GB"/>
-                <w14:ligatures w14:val="none"/>
-              </w:rPr>
-            </w:pPr>
-            <w:r>
-              <w:rPr>
-                <w:rFonts w:ascii="Aptos Narrow" w:eastAsia="Times New Roman" w:hAnsi="Aptos Narrow" w:cs="Times New Roman"/>
-                <w:color w:val="000000"/>
-                <w:kern w:val="0"/>
-                <w:sz w:val="22"/>
-                <w:szCs w:val="22"/>
-                <w:lang w:eastAsia="en-GB"/>
-                <w14:ligatures w14:val="none"/>
-              </w:rPr>
-              <w:t>manually</w:t>
-            </w:r>
-            <w:r>
-              <w:rPr>
-                <w:rFonts w:ascii="Aptos Narrow" w:eastAsia="Times New Roman" w:hAnsi="Aptos Narrow" w:cs="Times New Roman"/>
-                <w:color w:val="000000"/>
-                <w:kern w:val="0"/>
-                <w:sz w:val="22"/>
-                <w:szCs w:val="22"/>
-                <w:lang w:eastAsia="en-GB"/>
-                <w14:ligatures w14:val="none"/>
-              </w:rPr>
-              <w:t xml:space="preserve"> added when available</w:t>
-            </w:r>
-          </w:p>
-        </w:tc>
-      </w:tr>
-      <w:tr>
-        <w:trPr>
-          <w:trHeight w:val="300"/>
-        </w:trPr>
-        <w:tc>
-          <w:tcPr>
-            <w:tcW w:w="2587" w:type="dxa"/>
-            <w:noWrap/>
-          </w:tcPr>
-          <w:p>
-            <w:pPr>
-              <w:rPr>
-                <w:rFonts w:ascii="Aptos Narrow" w:eastAsia="Times New Roman" w:hAnsi="Aptos Narrow" w:cs="Times New Roman"/>
-                <w:color w:val="000000"/>
-                <w:kern w:val="0"/>
-                <w:sz w:val="22"/>
-                <w:szCs w:val="22"/>
-                <w:lang w:eastAsia="en-GB"/>
-                <w14:ligatures w14:val="none"/>
-              </w:rPr>
-            </w:pPr>
-            <w:r>
-              <w:rPr>
-                <w:rFonts w:ascii="Aptos Narrow" w:eastAsia="Times New Roman" w:hAnsi="Aptos Narrow" w:cs="Times New Roman"/>
-                <w:color w:val="000000"/>
-                <w:kern w:val="0"/>
-                <w:sz w:val="22"/>
-                <w:szCs w:val="22"/>
-                <w:lang w:eastAsia="en-GB"/>
-                <w14:ligatures w14:val="none"/>
-              </w:rPr>
-              <w:t>Folder location</w:t>
-            </w:r>
-          </w:p>
-        </w:tc>
-        <w:tc>
-          <w:tcPr>
-            <w:tcW w:w="7059" w:type="dxa"/>
-            <w:noWrap/>
-          </w:tcPr>
-          <w:p>
-            <w:pPr>
-              <w:rPr>
-                <w:rFonts w:ascii="Aptos Narrow" w:eastAsia="Times New Roman" w:hAnsi="Aptos Narrow" w:cs="Times New Roman"/>
-                <w:color w:val="000000"/>
-                <w:kern w:val="0"/>
-                <w:sz w:val="22"/>
-                <w:szCs w:val="22"/>
-                <w:lang w:eastAsia="en-GB"/>
-                <w14:ligatures w14:val="none"/>
-              </w:rPr>
-            </w:pPr>
-            <w:r>
-              <w:rPr>
-                <w:rFonts w:ascii="Aptos Narrow" w:eastAsia="Times New Roman" w:hAnsi="Aptos Narrow" w:cs="Times New Roman"/>
-                <w:color w:val="000000"/>
-                <w:kern w:val="0"/>
-                <w:sz w:val="22"/>
-                <w:szCs w:val="22"/>
-                <w:lang w:eastAsia="en-GB"/>
-                <w14:ligatures w14:val="none"/>
-              </w:rPr>
-              <w:t>In the beginning it will be in gjesus3/publication/&lt;short name&gt; but after a set time it will be moved to offline media or cold cloud storage, but the registry entry will remain</w:t>
-            </w:r>
-          </w:p>
-        </w:tc>
-      </w:tr>
-      <w:tr>
-        <w:trPr>
-          <w:trHeight w:val="300"/>
-        </w:trPr>
-        <w:tc>
-          <w:tcPr>
-            <w:tcW w:w="2587" w:type="dxa"/>
-            <w:noWrap/>
-          </w:tcPr>
-          <w:p>
-            <w:pPr>
-              <w:rPr>
-                <w:rFonts w:ascii="Aptos Narrow" w:eastAsia="Times New Roman" w:hAnsi="Aptos Narrow" w:cs="Times New Roman"/>
-                <w:color w:val="000000"/>
-                <w:kern w:val="0"/>
-                <w:sz w:val="22"/>
-                <w:szCs w:val="22"/>
-                <w:lang w:eastAsia="en-GB"/>
-                <w14:ligatures w14:val="none"/>
-              </w:rPr>
-            </w:pPr>
-            <w:r>
-              <w:rPr>
-                <w:rFonts w:ascii="Aptos Narrow" w:eastAsia="Times New Roman" w:hAnsi="Aptos Narrow" w:cs="Times New Roman"/>
-                <w:color w:val="000000"/>
-                <w:kern w:val="0"/>
-                <w:sz w:val="22"/>
-                <w:szCs w:val="22"/>
-                <w:lang w:eastAsia="en-GB"/>
-                <w14:ligatures w14:val="none"/>
-              </w:rPr>
-              <w:t xml:space="preserve">Repository </w:t>
-            </w:r>
-          </w:p>
-        </w:tc>
-        <w:tc>
-          <w:tcPr>
-            <w:tcW w:w="7059" w:type="dxa"/>
-            <w:noWrap/>
-          </w:tcPr>
-          <w:p>
-            <w:pPr>
-              <w:rPr>
-                <w:rFonts w:ascii="Aptos Narrow" w:eastAsia="Times New Roman" w:hAnsi="Aptos Narrow" w:cs="Times New Roman"/>
-                <w:color w:val="000000"/>
-                <w:kern w:val="0"/>
-                <w:sz w:val="22"/>
-                <w:szCs w:val="22"/>
-                <w:lang w:eastAsia="en-GB"/>
-                <w14:ligatures w14:val="none"/>
-              </w:rPr>
-            </w:pPr>
-            <w:r>
-              <w:rPr>
-                <w:rFonts w:ascii="Aptos Narrow" w:eastAsia="Times New Roman" w:hAnsi="Aptos Narrow" w:cs="Times New Roman"/>
-                <w:color w:val="000000"/>
-                <w:kern w:val="0"/>
-                <w:sz w:val="22"/>
-                <w:szCs w:val="22"/>
-                <w:lang w:eastAsia="en-GB"/>
-                <w14:ligatures w14:val="none"/>
-              </w:rPr>
-              <w:t>DOI or link to any other repository where the data was put (Zenodo in our case)</w:t>
-            </w:r>
-          </w:p>
-        </w:tc>
-      </w:tr>
-      <w:tr>
-        <w:trPr>
-          <w:trHeight w:val="300"/>
-        </w:trPr>
-        <w:tc>
-          <w:tcPr>
-            <w:tcW w:w="2587" w:type="dxa"/>
-            <w:noWrap/>
-          </w:tcPr>
-          <w:p>
-            <w:pPr>
-              <w:rPr>
-                <w:rFonts w:ascii="Aptos Narrow" w:eastAsia="Times New Roman" w:hAnsi="Aptos Narrow" w:cs="Times New Roman"/>
-                <w:color w:val="000000"/>
-                <w:kern w:val="0"/>
-                <w:sz w:val="22"/>
-                <w:szCs w:val="22"/>
-                <w:lang w:eastAsia="en-GB"/>
-                <w14:ligatures w14:val="none"/>
-              </w:rPr>
-            </w:pPr>
-            <w:r>
-              <w:rPr>
-                <w:rFonts w:ascii="Aptos Narrow" w:eastAsia="Times New Roman" w:hAnsi="Aptos Narrow" w:cs="Times New Roman"/>
-                <w:color w:val="000000"/>
-                <w:kern w:val="0"/>
-                <w:sz w:val="22"/>
-                <w:szCs w:val="22"/>
-                <w:lang w:eastAsia="en-GB"/>
-                <w14:ligatures w14:val="none"/>
-              </w:rPr>
-              <w:t xml:space="preserve"> Created date</w:t>
-            </w:r>
-          </w:p>
-        </w:tc>
-        <w:tc>
-          <w:tcPr>
-            <w:tcW w:w="7059" w:type="dxa"/>
-            <w:noWrap/>
-          </w:tcPr>
-          <w:p>
-            <w:pPr>
-              <w:rPr>
-                <w:rFonts w:ascii="Aptos Narrow" w:eastAsia="Times New Roman" w:hAnsi="Aptos Narrow" w:cs="Times New Roman"/>
-                <w:color w:val="000000"/>
-                <w:kern w:val="0"/>
-                <w:sz w:val="22"/>
-                <w:szCs w:val="22"/>
-                <w:lang w:eastAsia="en-GB"/>
-                <w14:ligatures w14:val="none"/>
-              </w:rPr>
-            </w:pPr>
-            <w:r>
-              <w:rPr>
-                <w:rFonts w:ascii="Aptos Narrow" w:eastAsia="Times New Roman" w:hAnsi="Aptos Narrow" w:cs="Times New Roman"/>
-                <w:color w:val="000000"/>
-                <w:kern w:val="0"/>
-                <w:sz w:val="22"/>
-                <w:szCs w:val="22"/>
-                <w:lang w:eastAsia="en-GB"/>
-                <w14:ligatures w14:val="none"/>
-              </w:rPr>
-              <w:t xml:space="preserve">When was the folder and registration created </w:t>
-            </w:r>
-          </w:p>
-        </w:tc>
-      </w:tr>
-      <w:tr>
-        <w:trPr>
-          <w:trHeight w:val="300"/>
-        </w:trPr>
-        <w:tc>
-          <w:tcPr>
-            <w:tcW w:w="2587" w:type="dxa"/>
-            <w:noWrap/>
-            <w:hideMark/>
-          </w:tcPr>
-          <w:p>
-            <w:pPr>
-              <w:rPr>
-                <w:rFonts w:ascii="Aptos Narrow" w:eastAsia="Times New Roman" w:hAnsi="Aptos Narrow" w:cs="Times New Roman"/>
-                <w:color w:val="000000"/>
-                <w:kern w:val="0"/>
-                <w:sz w:val="22"/>
-                <w:szCs w:val="22"/>
-                <w:lang w:eastAsia="en-GB"/>
-                <w14:ligatures w14:val="none"/>
-              </w:rPr>
-            </w:pPr>
-            <w:r>
-              <w:rPr>
-                <w:rFonts w:ascii="Aptos Narrow" w:eastAsia="Times New Roman" w:hAnsi="Aptos Narrow" w:cs="Times New Roman"/>
-                <w:color w:val="000000"/>
-                <w:kern w:val="0"/>
-                <w:sz w:val="22"/>
-                <w:szCs w:val="22"/>
-                <w:lang w:eastAsia="en-GB"/>
-                <w14:ligatures w14:val="none"/>
-              </w:rPr>
-              <w:lastRenderedPageBreak/>
-              <w:t>Closed date</w:t>
-            </w:r>
-          </w:p>
-        </w:tc>
-        <w:tc>
-          <w:tcPr>
-            <w:tcW w:w="7059" w:type="dxa"/>
-            <w:noWrap/>
-            <w:hideMark/>
-          </w:tcPr>
-          <w:p>
-            <w:pPr>
-              <w:rPr>
-                <w:rFonts w:ascii="Aptos Narrow" w:eastAsia="Times New Roman" w:hAnsi="Aptos Narrow" w:cs="Times New Roman"/>
-                <w:color w:val="000000"/>
-                <w:kern w:val="0"/>
-                <w:sz w:val="22"/>
-                <w:szCs w:val="22"/>
-                <w:lang w:eastAsia="en-GB"/>
-                <w14:ligatures w14:val="none"/>
-              </w:rPr>
-            </w:pPr>
-            <w:r>
-              <w:rPr>
-                <w:rFonts w:ascii="Aptos Narrow" w:eastAsia="Times New Roman" w:hAnsi="Aptos Narrow" w:cs="Times New Roman"/>
-                <w:color w:val="000000"/>
-                <w:kern w:val="0"/>
-                <w:sz w:val="22"/>
-                <w:szCs w:val="22"/>
-                <w:lang w:eastAsia="en-GB"/>
-                <w14:ligatures w14:val="none"/>
-              </w:rPr>
-              <w:t>When was it published or otherwise terminated</w:t>
-            </w:r>
-          </w:p>
-        </w:tc>
-      </w:tr>
-    </w:tbl>
-    <w:p>
-      <w:r>
-        <w:t>Others?</w:t>
-      </w:r>
-    </w:p>
-    <w:p>
-      <w:r>
-        <w:t>Are there other fields you would like to see?</w:t>
-      </w:r>
-    </w:p>
-    <w:p>
-      <w:pPr>
-        <w:pStyle w:val="ListParagraph"/>
-        <w:numPr>
-          <w:ilvl w:val="0"/>
-          <w:numId w:val="2"/>
-        </w:numPr>
-      </w:pPr>
-      <w:commentRangeStart w:id="3"/>
-      <w:r>
-        <w:t>Other fields???</w:t>
-      </w:r>
-      <w:commentRangeEnd w:id="3"/>
-      <w:r>
-        <w:rPr>
-          <w:rStyle w:val="CommentReference"/>
-          <w:sz w:val="24"/>
-          <w:szCs w:val="24"/>
-        </w:rPr>
-        <w:commentReference w:id="3"/>
-      </w:r>
-    </w:p>
-    <w:p>
-      <w:pPr>
-        <w:pStyle w:val="Heading3"/>
-      </w:pPr>
-      <w:r>
-        <w:t>P</w:t>
-      </w:r>
-      <w:r>
-        <w:t>rojects</w:t>
-      </w:r>
-      <w:r>
-        <w:t xml:space="preserve"> </w:t>
-      </w:r>
-    </w:p>
-    <w:p>
-      <w:r>
-        <w:t>We still need to d</w:t>
-      </w:r>
-      <w:r>
-        <w:t>efine what “a project” means for this pilot (even if fuzzy): expected use cases and anti-patterns</w:t>
-      </w:r>
-      <w:r>
-        <w:t xml:space="preserve">. What is expected is that there will be a lot of flexibility with the structure of this dir. </w:t>
-      </w:r>
-      <w:r>
-        <w:t xml:space="preserve">Despite the internal structure, </w:t>
-      </w:r>
-      <w:r>
-        <w:t>project</w:t>
-      </w:r>
-      <w:r>
-        <w:t xml:space="preserve"> folders will </w:t>
-      </w:r>
-      <w:r>
-        <w:t xml:space="preserve">also </w:t>
-      </w:r>
-      <w:r>
-        <w:t xml:space="preserve">enforce </w:t>
-      </w:r>
-      <w:r>
-        <w:t>data provenance</w:t>
-      </w:r>
-      <w:r>
-        <w:t xml:space="preserve"> recording (described elsewhere) so we can track where each file came from.</w:t>
-      </w:r>
-      <w:r>
-        <w:t xml:space="preserve"> Projects will be temporary and may be migrated to publications, external drives or just erased after a set time period.</w:t>
-      </w:r>
-    </w:p>
-    <w:p>
-      <w:r>
-        <w:t>Here we are interested in your feedback of the metadata fields for the registry. It is likely these will need to be manually created and updated, so we are keeping it light.</w:t>
-      </w:r>
-    </w:p>
-    <w:tbl>
-      <w:tblPr>
-        <w:tblStyle w:val="TableGrid"/>
-        <w:tblW w:w="9646" w:type="dxa"/>
-        <w:tblLook w:val="04A0" w:firstRow="1" w:lastRow="0" w:firstColumn="1" w:lastColumn="0" w:noHBand="0" w:noVBand="1"/>
-      </w:tblPr>
-      <w:tblGrid>
-        <w:gridCol w:w="2587"/>
-        <w:gridCol w:w="7059"/>
-      </w:tblGrid>
-      <w:tr>
-        <w:trPr>
-          <w:trHeight w:val="300"/>
-        </w:trPr>
-        <w:tc>
-          <w:tcPr>
-            <w:tcW w:w="2587" w:type="dxa"/>
-            <w:shd w:val="clear" w:color="auto" w:fill="F2F2F2" w:themeFill="background1" w:themeFillShade="F2"/>
-            <w:noWrap/>
-            <w:hideMark/>
-          </w:tcPr>
-          <w:p>
-            <w:pPr>
-              <w:rPr>
-                <w:rFonts w:ascii="Aptos Narrow" w:eastAsia="Times New Roman" w:hAnsi="Aptos Narrow" w:cs="Times New Roman"/>
-                <w:b/>
-                <w:bCs/>
-                <w:color w:val="000000"/>
-                <w:kern w:val="0"/>
-                <w:sz w:val="22"/>
-                <w:szCs w:val="22"/>
-                <w:lang w:eastAsia="en-GB"/>
-                <w14:ligatures w14:val="none"/>
-              </w:rPr>
-            </w:pPr>
-            <w:commentRangeStart w:id="4"/>
-            <w:r>
-              <w:rPr>
-                <w:rFonts w:ascii="Aptos Narrow" w:eastAsia="Times New Roman" w:hAnsi="Aptos Narrow" w:cs="Times New Roman"/>
-                <w:b/>
-                <w:bCs/>
-                <w:color w:val="000000"/>
-                <w:kern w:val="0"/>
-                <w:sz w:val="22"/>
-                <w:szCs w:val="22"/>
-                <w:lang w:eastAsia="en-GB"/>
-                <w14:ligatures w14:val="none"/>
-              </w:rPr>
-              <w:t>Field</w:t>
-            </w:r>
-            <w:commentRangeEnd w:id="4"/>
-            <w:r>
-              <w:rPr>
-                <w:rStyle w:val="CommentReference"/>
-                <w:rFonts w:ascii="Aptos Narrow" w:eastAsia="Times New Roman" w:hAnsi="Aptos Narrow" w:cs="Times New Roman"/>
-                <w:b/>
-                <w:bCs/>
-                <w:color w:val="000000"/>
-                <w:kern w:val="0"/>
-                <w:sz w:val="22"/>
-                <w:szCs w:val="22"/>
-                <w:lang w:eastAsia="en-GB"/>
-                <w14:ligatures w14:val="none"/>
-              </w:rPr>
-              <w:commentReference w:id="4"/>
-            </w:r>
-          </w:p>
-        </w:tc>
-        <w:tc>
-          <w:tcPr>
-            <w:tcW w:w="7059" w:type="dxa"/>
-            <w:shd w:val="clear" w:color="auto" w:fill="F2F2F2" w:themeFill="background1" w:themeFillShade="F2"/>
-            <w:noWrap/>
-            <w:hideMark/>
-          </w:tcPr>
-          <w:p>
-            <w:pPr>
-              <w:rPr>
-                <w:rFonts w:ascii="Aptos Narrow" w:eastAsia="Times New Roman" w:hAnsi="Aptos Narrow" w:cs="Times New Roman"/>
-                <w:b/>
-                <w:bCs/>
-                <w:color w:val="000000"/>
-                <w:kern w:val="0"/>
-                <w:sz w:val="22"/>
-                <w:szCs w:val="22"/>
-                <w:lang w:eastAsia="en-GB"/>
-                <w14:ligatures w14:val="none"/>
-              </w:rPr>
-            </w:pPr>
-            <w:r>
-              <w:rPr>
-                <w:rFonts w:ascii="Aptos Narrow" w:eastAsia="Times New Roman" w:hAnsi="Aptos Narrow" w:cs="Times New Roman"/>
-                <w:b/>
-                <w:bCs/>
-                <w:color w:val="000000"/>
-                <w:kern w:val="0"/>
-                <w:sz w:val="22"/>
-                <w:szCs w:val="22"/>
-                <w:lang w:eastAsia="en-GB"/>
-                <w14:ligatures w14:val="none"/>
-              </w:rPr>
-              <w:t xml:space="preserve">Description </w:t>
-            </w:r>
-          </w:p>
-        </w:tc>
-      </w:tr>
-      <w:tr>
-        <w:trPr>
-          <w:trHeight w:val="300"/>
-        </w:trPr>
-        <w:tc>
-          <w:tcPr>
-            <w:tcW w:w="2587" w:type="dxa"/>
-            <w:noWrap/>
-          </w:tcPr>
-          <w:p>
-            <w:pPr>
-              <w:rPr>
-                <w:rFonts w:ascii="Aptos Narrow" w:eastAsia="Times New Roman" w:hAnsi="Aptos Narrow" w:cs="Times New Roman"/>
-                <w:color w:val="000000"/>
-                <w:kern w:val="0"/>
-                <w:sz w:val="22"/>
-                <w:szCs w:val="22"/>
-                <w:lang w:eastAsia="en-GB"/>
-                <w14:ligatures w14:val="none"/>
-              </w:rPr>
-            </w:pPr>
-            <w:r>
-              <w:t>ProjectID</w:t>
-            </w:r>
-          </w:p>
-        </w:tc>
-        <w:tc>
-          <w:tcPr>
-            <w:tcW w:w="7059" w:type="dxa"/>
-            <w:noWrap/>
-          </w:tcPr>
-          <w:p>
-            <w:pPr>
-              <w:rPr>
-                <w:rFonts w:ascii="Aptos Narrow" w:eastAsia="Times New Roman" w:hAnsi="Aptos Narrow" w:cs="Times New Roman"/>
-                <w:color w:val="000000"/>
-                <w:kern w:val="0"/>
-                <w:sz w:val="22"/>
-                <w:szCs w:val="22"/>
-                <w:lang w:eastAsia="en-GB"/>
-                <w14:ligatures w14:val="none"/>
-              </w:rPr>
-            </w:pPr>
-            <w:r>
-              <w:rPr>
-                <w:rFonts w:ascii="Aptos Narrow" w:eastAsia="Times New Roman" w:hAnsi="Aptos Narrow" w:cs="Times New Roman"/>
-                <w:color w:val="000000"/>
-                <w:kern w:val="0"/>
-                <w:sz w:val="22"/>
-                <w:szCs w:val="22"/>
-                <w:lang w:eastAsia="en-GB"/>
-                <w14:ligatures w14:val="none"/>
-              </w:rPr>
-              <w:t xml:space="preserve">A unique internal ID for each </w:t>
-            </w:r>
-            <w:r>
-              <w:rPr>
-                <w:rFonts w:ascii="Aptos Narrow" w:eastAsia="Times New Roman" w:hAnsi="Aptos Narrow" w:cs="Times New Roman"/>
-                <w:color w:val="000000"/>
-                <w:kern w:val="0"/>
-                <w:sz w:val="22"/>
-                <w:szCs w:val="22"/>
-                <w:lang w:eastAsia="en-GB"/>
-                <w14:ligatures w14:val="none"/>
-              </w:rPr>
-              <w:t>project</w:t>
-            </w:r>
-            <w:r>
-              <w:rPr>
-                <w:rFonts w:ascii="Aptos Narrow" w:eastAsia="Times New Roman" w:hAnsi="Aptos Narrow" w:cs="Times New Roman"/>
-                <w:color w:val="000000"/>
-                <w:kern w:val="0"/>
-                <w:sz w:val="22"/>
-                <w:szCs w:val="22"/>
-                <w:lang w:eastAsia="en-GB"/>
-                <w14:ligatures w14:val="none"/>
-              </w:rPr>
-              <w:t xml:space="preserve">, likely a counter, e.g. </w:t>
-            </w:r>
-            <w:r>
-              <w:rPr>
-                <w:rFonts w:ascii="Aptos Narrow" w:eastAsia="Times New Roman" w:hAnsi="Aptos Narrow" w:cs="Times New Roman"/>
-                <w:color w:val="000000"/>
-                <w:kern w:val="0"/>
-                <w:sz w:val="22"/>
-                <w:szCs w:val="22"/>
-                <w:lang w:eastAsia="en-GB"/>
-                <w14:ligatures w14:val="none"/>
-              </w:rPr>
-              <w:t>PROJ</w:t>
-            </w:r>
-            <w:r>
-              <w:rPr>
-                <w:rFonts w:ascii="Aptos Narrow" w:eastAsia="Times New Roman" w:hAnsi="Aptos Narrow" w:cs="Times New Roman"/>
-                <w:color w:val="000000"/>
-                <w:kern w:val="0"/>
-                <w:sz w:val="22"/>
-                <w:szCs w:val="22"/>
-                <w:lang w:eastAsia="en-GB"/>
-                <w14:ligatures w14:val="none"/>
-              </w:rPr>
-              <w:t xml:space="preserve">-0001 </w:t>
-            </w:r>
-          </w:p>
-        </w:tc>
-      </w:tr>
-      <w:tr>
-        <w:trPr>
-          <w:trHeight w:val="300"/>
-        </w:trPr>
-        <w:tc>
-          <w:tcPr>
-            <w:tcW w:w="2587" w:type="dxa"/>
-            <w:noWrap/>
-          </w:tcPr>
-          <w:p>
-            <w:pPr>
-              <w:rPr>
-                <w:rFonts w:ascii="Aptos Narrow" w:eastAsia="Times New Roman" w:hAnsi="Aptos Narrow" w:cs="Times New Roman"/>
-                <w:color w:val="000000"/>
-                <w:kern w:val="0"/>
-                <w:sz w:val="22"/>
-                <w:szCs w:val="22"/>
-                <w:lang w:eastAsia="en-GB"/>
-                <w14:ligatures w14:val="none"/>
-              </w:rPr>
-            </w:pPr>
-            <w:r>
-              <w:rPr>
-                <w:rFonts w:ascii="Aptos Narrow" w:eastAsia="Times New Roman" w:hAnsi="Aptos Narrow" w:cs="Times New Roman"/>
-                <w:color w:val="000000"/>
-                <w:kern w:val="0"/>
-                <w:sz w:val="22"/>
-                <w:szCs w:val="22"/>
-                <w:lang w:eastAsia="en-GB"/>
-                <w14:ligatures w14:val="none"/>
-              </w:rPr>
-              <w:t>Short name</w:t>
-            </w:r>
-          </w:p>
-        </w:tc>
-        <w:tc>
-          <w:tcPr>
-            <w:tcW w:w="7059" w:type="dxa"/>
-            <w:noWrap/>
-          </w:tcPr>
-          <w:p>
-            <w:pPr>
-              <w:rPr>
-                <w:rFonts w:ascii="Aptos Narrow" w:eastAsia="Times New Roman" w:hAnsi="Aptos Narrow" w:cs="Times New Roman"/>
-                <w:color w:val="000000"/>
-                <w:kern w:val="0"/>
-                <w:sz w:val="22"/>
-                <w:szCs w:val="22"/>
-                <w:lang w:eastAsia="en-GB"/>
-                <w14:ligatures w14:val="none"/>
-              </w:rPr>
-            </w:pPr>
-            <w:r>
-              <w:rPr>
-                <w:rFonts w:ascii="Aptos Narrow" w:eastAsia="Times New Roman" w:hAnsi="Aptos Narrow" w:cs="Times New Roman"/>
-                <w:color w:val="000000"/>
-                <w:kern w:val="0"/>
-                <w:sz w:val="22"/>
-                <w:szCs w:val="22"/>
-                <w:lang w:eastAsia="en-GB"/>
-                <w14:ligatures w14:val="none"/>
-              </w:rPr>
-              <w:t xml:space="preserve">Short but </w:t>
-            </w:r>
-            <w:r>
-              <w:rPr>
-                <w:rFonts w:ascii="Aptos Narrow" w:eastAsia="Times New Roman" w:hAnsi="Aptos Narrow" w:cs="Times New Roman"/>
-                <w:color w:val="000000"/>
-                <w:kern w:val="0"/>
-                <w:sz w:val="22"/>
-                <w:szCs w:val="22"/>
-                <w:lang w:eastAsia="en-GB"/>
-                <w14:ligatures w14:val="none"/>
-              </w:rPr>
-              <w:t>descriptive</w:t>
-            </w:r>
-            <w:r>
-              <w:rPr>
-                <w:rFonts w:ascii="Aptos Narrow" w:eastAsia="Times New Roman" w:hAnsi="Aptos Narrow" w:cs="Times New Roman"/>
-                <w:color w:val="000000"/>
-                <w:kern w:val="0"/>
-                <w:sz w:val="22"/>
-                <w:szCs w:val="22"/>
-                <w:lang w:eastAsia="en-GB"/>
-                <w14:ligatures w14:val="none"/>
-              </w:rPr>
-              <w:t xml:space="preserve"> and unique publication name that can be known before publication when project is created (same name as publication folder)</w:t>
-            </w:r>
-          </w:p>
-        </w:tc>
-      </w:tr>
-      <w:tr>
-        <w:trPr>
-          <w:trHeight w:val="300"/>
-        </w:trPr>
-        <w:tc>
-          <w:tcPr>
-            <w:tcW w:w="2587" w:type="dxa"/>
-            <w:noWrap/>
-          </w:tcPr>
-          <w:p>
-            <w:pPr>
-              <w:rPr>
-                <w:rFonts w:ascii="Aptos Narrow" w:eastAsia="Times New Roman" w:hAnsi="Aptos Narrow" w:cs="Times New Roman"/>
-                <w:color w:val="000000"/>
-                <w:kern w:val="0"/>
-                <w:sz w:val="22"/>
-                <w:szCs w:val="22"/>
-                <w:lang w:eastAsia="en-GB"/>
-                <w14:ligatures w14:val="none"/>
-              </w:rPr>
-            </w:pPr>
-            <w:r>
-              <w:t>description</w:t>
-            </w:r>
-          </w:p>
-        </w:tc>
-        <w:tc>
-          <w:tcPr>
-            <w:tcW w:w="7059" w:type="dxa"/>
-            <w:noWrap/>
-          </w:tcPr>
-          <w:p>
-            <w:pPr>
-              <w:rPr>
-                <w:rFonts w:ascii="Aptos Narrow" w:eastAsia="Times New Roman" w:hAnsi="Aptos Narrow" w:cs="Times New Roman"/>
-                <w:color w:val="000000"/>
-                <w:kern w:val="0"/>
-                <w:sz w:val="22"/>
-                <w:szCs w:val="22"/>
-                <w:lang w:eastAsia="en-GB"/>
-                <w14:ligatures w14:val="none"/>
-              </w:rPr>
-            </w:pPr>
-            <w:r>
-              <w:rPr>
-                <w:rFonts w:ascii="Aptos Narrow" w:eastAsia="Times New Roman" w:hAnsi="Aptos Narrow" w:cs="Times New Roman"/>
-                <w:color w:val="000000"/>
-                <w:kern w:val="0"/>
-                <w:sz w:val="22"/>
-                <w:szCs w:val="22"/>
-                <w:lang w:eastAsia="en-GB"/>
-                <w14:ligatures w14:val="none"/>
-              </w:rPr>
-              <w:t>This filed can be dynamic up to the title of the final publication</w:t>
-            </w:r>
-          </w:p>
-        </w:tc>
-      </w:tr>
-      <w:tr>
-        <w:trPr>
-          <w:trHeight w:val="300"/>
-        </w:trPr>
-        <w:tc>
-          <w:tcPr>
-            <w:tcW w:w="2587" w:type="dxa"/>
-            <w:noWrap/>
-          </w:tcPr>
-          <w:p>
-            <w:pPr>
-              <w:rPr>
-                <w:rFonts w:ascii="Aptos Narrow" w:eastAsia="Times New Roman" w:hAnsi="Aptos Narrow" w:cs="Times New Roman"/>
-                <w:color w:val="000000"/>
-                <w:kern w:val="0"/>
-                <w:sz w:val="22"/>
-                <w:szCs w:val="22"/>
-                <w:lang w:eastAsia="en-GB"/>
-                <w14:ligatures w14:val="none"/>
-              </w:rPr>
-            </w:pPr>
-            <w:r>
-              <w:t>SPOC/owner</w:t>
-            </w:r>
-          </w:p>
-        </w:tc>
-        <w:tc>
-          <w:tcPr>
-            <w:tcW w:w="7059" w:type="dxa"/>
-            <w:noWrap/>
-          </w:tcPr>
-          <w:p>
-            <w:pPr>
-              <w:rPr>
-                <w:rFonts w:ascii="Aptos Narrow" w:eastAsia="Times New Roman" w:hAnsi="Aptos Narrow" w:cs="Times New Roman"/>
-                <w:color w:val="000000"/>
-                <w:kern w:val="0"/>
-                <w:sz w:val="22"/>
-                <w:szCs w:val="22"/>
-                <w:lang w:eastAsia="en-GB"/>
-                <w14:ligatures w14:val="none"/>
-              </w:rPr>
-            </w:pPr>
-            <w:r>
-              <w:rPr>
-                <w:rFonts w:ascii="Aptos Narrow" w:eastAsia="Times New Roman" w:hAnsi="Aptos Narrow" w:cs="Times New Roman"/>
-                <w:color w:val="000000"/>
-                <w:kern w:val="0"/>
-                <w:sz w:val="22"/>
-                <w:szCs w:val="22"/>
-                <w:lang w:eastAsia="en-GB"/>
-                <w14:ligatures w14:val="none"/>
-              </w:rPr>
-              <w:t>self-evident and manually updated</w:t>
-            </w:r>
-          </w:p>
-        </w:tc>
-      </w:tr>
-      <w:tr>
-        <w:trPr>
-          <w:trHeight w:val="300"/>
-        </w:trPr>
-        <w:tc>
-          <w:tcPr>
-            <w:tcW w:w="2587" w:type="dxa"/>
-            <w:noWrap/>
-          </w:tcPr>
-          <w:p>
-            <w:pPr>
-              <w:rPr>
-                <w:rFonts w:ascii="Aptos Narrow" w:eastAsia="Times New Roman" w:hAnsi="Aptos Narrow" w:cs="Times New Roman"/>
-                <w:color w:val="000000"/>
-                <w:kern w:val="0"/>
-                <w:sz w:val="22"/>
-                <w:szCs w:val="22"/>
-                <w:lang w:eastAsia="en-GB"/>
-                <w14:ligatures w14:val="none"/>
-              </w:rPr>
-            </w:pPr>
-            <w:r>
-              <w:t>S</w:t>
-            </w:r>
-            <w:r>
-              <w:t>tart</w:t>
+              <w:t>Start</w:t>
             </w:r>
             <w:r>
               <w:t xml:space="preserve"> </w:t>
@@ -4374,14 +3918,14 @@
       </w:rPr>
     </w:lvl>
   </w:abstractNum>
-  <w:num w:numId="1" w16cid:durableId="247858230">
-    <w:abstractNumId w:val="0"/>
+  <w:num w:numId="1" w16cid:durableId="2044360595">
+    <w:abstractNumId w:val="2"/>
   </w:num>
   <w:num w:numId="2" w16cid:durableId="2057393108">
     <w:abstractNumId w:val="3"/>
   </w:num>
-  <w:num w:numId="3" w16cid:durableId="2044360595">
-    <w:abstractNumId w:val="2"/>
+  <w:num w:numId="3" w16cid:durableId="247858230">
+    <w:abstractNumId w:val="0"/>
   </w:num>
   <w:num w:numId="4" w16cid:durableId="879822320">
     <w:abstractNumId w:val="1"/>
@@ -4999,6 +4543,7 @@
   <w:style w:type="character" w:default="1" w:styleId="DefaultParagraphFont">
     <w:name w:val="Default Paragraph Font"/>
     <w:uiPriority w:val="1"/>
+    <w:semiHidden/>
     <w:unhideWhenUsed/>
   </w:style>
   <w:style w:type="table" w:default="1" w:styleId="TableNormal">

</xml_diff>